<commit_message>
Trabajando en el código
</commit_message>
<xml_diff>
--- a/Control_git_miimperio.docx
+++ b/Control_git_miimperio.docx
@@ -1,78 +1,78 @@
 
 <file path=word/document.xml><?xml version="1.0" encoding="utf-8"?>
-<w:document xmlns:mc="http://schemas.openxmlformats.org/markup-compatibility/2006" xmlns:o="urn:schemas-microsoft-com:office:office" xmlns:r="http://schemas.openxmlformats.org/officeDocument/2006/relationships" xmlns:m="http://schemas.openxmlformats.org/officeDocument/2006/math" xmlns:v="urn:schemas-microsoft-com:vml" xmlns:wp="http://schemas.openxmlformats.org/drawingml/2006/wordprocessingDrawing" xmlns:w10="urn:schemas-microsoft-com:office:word" xmlns:w="http://schemas.openxmlformats.org/wordprocessingml/2006/main" xmlns:wne="http://schemas.microsoft.com/office/word/2006/wordml" xmlns:sl="http://schemas.openxmlformats.org/schemaLibrary/2006/main" xmlns:a="http://schemas.openxmlformats.org/drawingml/2006/main" xmlns:pic="http://schemas.openxmlformats.org/drawingml/2006/picture" xmlns:c="http://schemas.openxmlformats.org/drawingml/2006/chart" xmlns:lc="http://schemas.openxmlformats.org/drawingml/2006/lockedCanvas" xmlns:dgm="http://schemas.openxmlformats.org/drawingml/2006/diagram" xmlns:wps="http://schemas.microsoft.com/office/word/2010/wordprocessingShape" xmlns:wpg="http://schemas.microsoft.com/office/word/2010/wordprocessingGroup" xmlns:w14="http://schemas.microsoft.com/office/word/2010/wordml" xmlns:w15="http://schemas.microsoft.com/office/word/2012/wordml" xmlns:w16="http://schemas.microsoft.com/office/word/2018/wordml" xmlns:w16cex="http://schemas.microsoft.com/office/word/2018/wordml/cex" xmlns:w16cid="http://schemas.microsoft.com/office/word/2016/wordml/cid" xmlns="http://schemas.microsoft.com/office/tasks/2019/documenttasks" xmlns:cr="http://schemas.microsoft.com/office/comments/2020/reactions">
+<w:document xmlns:wpc="http://schemas.microsoft.com/office/word/2010/wordprocessingCanvas" xmlns:cx="http://schemas.microsoft.com/office/drawing/2014/chartex" xmlns:cx1="http://schemas.microsoft.com/office/drawing/2015/9/8/chartex" xmlns:cx2="http://schemas.microsoft.com/office/drawing/2015/10/21/chartex" xmlns:cx3="http://schemas.microsoft.com/office/drawing/2016/5/9/chartex" xmlns:cx4="http://schemas.microsoft.com/office/drawing/2016/5/10/chartex" xmlns:cx5="http://schemas.microsoft.com/office/drawing/2016/5/11/chartex" xmlns:cx6="http://schemas.microsoft.com/office/drawing/2016/5/12/chartex" xmlns:cx7="http://schemas.microsoft.com/office/drawing/2016/5/13/chartex" xmlns:cx8="http://schemas.microsoft.com/office/drawing/2016/5/14/chartex" xmlns:mc="http://schemas.openxmlformats.org/markup-compatibility/2006" xmlns:aink="http://schemas.microsoft.com/office/drawing/2016/ink" xmlns:am3d="http://schemas.microsoft.com/office/drawing/2017/model3d" xmlns:o="urn:schemas-microsoft-com:office:office" xmlns:oel="http://schemas.microsoft.com/office/2019/extlst" xmlns:r="http://schemas.openxmlformats.org/officeDocument/2006/relationships" xmlns:m="http://schemas.openxmlformats.org/officeDocument/2006/math" xmlns:v="urn:schemas-microsoft-com:vml" xmlns:wp14="http://schemas.microsoft.com/office/word/2010/wordprocessingDrawing" xmlns:wp="http://schemas.openxmlformats.org/drawingml/2006/wordprocessingDrawing" xmlns:w10="urn:schemas-microsoft-com:office:word" xmlns:w="http://schemas.openxmlformats.org/wordprocessingml/2006/main" xmlns:w14="http://schemas.microsoft.com/office/word/2010/wordml" xmlns:w15="http://schemas.microsoft.com/office/word/2012/wordml" xmlns:w16cex="http://schemas.microsoft.com/office/word/2018/wordml/cex" xmlns:w16cid="http://schemas.microsoft.com/office/word/2016/wordml/cid" xmlns:w16="http://schemas.microsoft.com/office/word/2018/wordml" xmlns:w16du="http://schemas.microsoft.com/office/word/2023/wordml/word16du" xmlns:w16sdtdh="http://schemas.microsoft.com/office/word/2020/wordml/sdtdatahash" xmlns:w16sdtfl="http://schemas.microsoft.com/office/word/2024/wordml/sdtformatlock" xmlns:w16se="http://schemas.microsoft.com/office/word/2015/wordml/symex" xmlns:wpg="http://schemas.microsoft.com/office/word/2010/wordprocessingGroup" xmlns:wpi="http://schemas.microsoft.com/office/word/2010/wordprocessingInk" xmlns:wne="http://schemas.microsoft.com/office/word/2006/wordml" xmlns:wps="http://schemas.microsoft.com/office/word/2010/wordprocessingShape" mc:Ignorable="w14 w15 w16se w16cid w16 w16cex w16sdtdh w16sdtfl w16du wp14">
   <w:body>
     <w:p>
       <w:pPr>
-        <w:pStyle w:val="Title"/>
-        <w:rPr/>
-      </w:pPr>
-      <w:bookmarkStart w:colFirst="0" w:colLast="0" w:name="_4cxzwmmpv2he" w:id="0"/>
+        <w:pStyle w:val="Ttulo"/>
+      </w:pPr>
+      <w:bookmarkStart w:id="0" w:name="_4cxzwmmpv2he" w:colFirst="0" w:colLast="0"/>
       <w:bookmarkEnd w:id="0"/>
       <w:r>
-        <w:rPr>
-          <w:rtl w:val="0"/>
-        </w:rPr>
-        <w:t xml:space="preserve">Control de versiones y desarrollo de MiImperio</w:t>
-      </w:r>
-    </w:p>
-    <w:p>
-      <w:pPr>
-        <w:pStyle w:val="Subtitle"/>
-        <w:rPr/>
-      </w:pPr>
-      <w:bookmarkStart w:colFirst="0" w:colLast="0" w:name="_1eg1aonzgh9l" w:id="1"/>
+        <w:t xml:space="preserve">Control de versiones y desarrollo de </w:t>
+      </w:r>
+      <w:proofErr w:type="spellStart"/>
+      <w:r>
+        <w:t>MiImperio</w:t>
+      </w:r>
+      <w:proofErr w:type="spellEnd"/>
+    </w:p>
+    <w:p>
+      <w:pPr>
+        <w:pStyle w:val="Subttulo"/>
+      </w:pPr>
+      <w:bookmarkStart w:id="1" w:name="_1eg1aonzgh9l" w:colFirst="0" w:colLast="0"/>
       <w:bookmarkEnd w:id="1"/>
       <w:r>
-        <w:rPr>
-          <w:rtl w:val="0"/>
-        </w:rPr>
-        <w:t xml:space="preserve">Nerea Fenollar Pereñíguez</w:t>
-      </w:r>
-    </w:p>
-    <w:p>
-      <w:pPr>
-        <w:pStyle w:val="Heading2"/>
+        <w:t>Nerea Fenollar Pereñíguez</w:t>
+      </w:r>
+    </w:p>
+    <w:p>
+      <w:pPr>
+        <w:pStyle w:val="Ttulo2"/>
         <w:numPr>
           <w:ilvl w:val="0"/>
           <w:numId w:val="1"/>
         </w:numPr>
-        <w:ind w:left="720" w:hanging="360"/>
+      </w:pPr>
+      <w:bookmarkStart w:id="2" w:name="_116is7fopr90" w:colFirst="0" w:colLast="0"/>
+      <w:bookmarkEnd w:id="2"/>
+      <w:r>
+        <w:t xml:space="preserve">Creación del directorio de trabajo y repositorio </w:t>
+      </w:r>
+      <w:proofErr w:type="spellStart"/>
+      <w:r>
+        <w:t>git</w:t>
+      </w:r>
+      <w:proofErr w:type="spellEnd"/>
+      <w:r>
+        <w:t>:</w:t>
+      </w:r>
+    </w:p>
+    <w:p>
+      <w:pPr>
+        <w:ind w:left="720"/>
+      </w:pPr>
+      <w:r>
         <w:rPr>
-          <w:u w:val="none"/>
+          <w:noProof/>
         </w:rPr>
-      </w:pPr>
-      <w:bookmarkStart w:colFirst="0" w:colLast="0" w:name="_116is7fopr90" w:id="2"/>
-      <w:bookmarkEnd w:id="2"/>
-      <w:r>
-        <w:rPr>
-          <w:rtl w:val="0"/>
-        </w:rPr>
-        <w:t xml:space="preserve">Creación del directorio de trabajo y repositorio git:</w:t>
-      </w:r>
-    </w:p>
-    <w:p>
-      <w:pPr>
-        <w:ind w:left="720" w:firstLine="0"/>
-        <w:rPr/>
-      </w:pPr>
-      <w:r>
-        <w:rPr/>
         <w:drawing>
-          <wp:inline distB="114300" distT="114300" distL="114300" distR="114300">
+          <wp:inline distT="114300" distB="114300" distL="114300" distR="114300" wp14:anchorId="000D7454" wp14:editId="1F3465D4">
             <wp:extent cx="5731200" cy="381000"/>
-            <wp:effectExtent b="0" l="0" r="0" t="0"/>
+            <wp:effectExtent l="0" t="0" r="0" b="0"/>
             <wp:docPr id="1" name="image5.png"/>
-            <a:graphic>
+            <wp:cNvGraphicFramePr/>
+            <a:graphic xmlns:a="http://schemas.openxmlformats.org/drawingml/2006/main">
               <a:graphicData uri="http://schemas.openxmlformats.org/drawingml/2006/picture">
-                <pic:pic>
+                <pic:pic xmlns:pic="http://schemas.openxmlformats.org/drawingml/2006/picture">
                   <pic:nvPicPr>
                     <pic:cNvPr id="0" name="image5.png"/>
                     <pic:cNvPicPr preferRelativeResize="0"/>
                   </pic:nvPicPr>
                   <pic:blipFill>
-                    <a:blip r:embed="rId6"/>
-                    <a:srcRect b="0" l="0" r="0" t="0"/>
+                    <a:blip r:embed="rId5"/>
+                    <a:srcRect/>
                     <a:stretch>
                       <a:fillRect/>
                     </a:stretch>
@@ -82,7 +82,9 @@
                       <a:off x="0" y="0"/>
                       <a:ext cx="5731200" cy="381000"/>
                     </a:xfrm>
-                    <a:prstGeom prst="rect"/>
+                    <a:prstGeom prst="rect">
+                      <a:avLst/>
+                    </a:prstGeom>
                     <a:ln/>
                   </pic:spPr>
                 </pic:pic>
@@ -91,76 +93,76 @@
           </wp:inline>
         </w:drawing>
       </w:r>
-      <w:r>
-        <w:rPr>
-          <w:rtl w:val="0"/>
-        </w:rPr>
-      </w:r>
-    </w:p>
-    <w:p>
-      <w:pPr>
-        <w:ind w:left="720" w:firstLine="0"/>
-        <w:rPr/>
-      </w:pPr>
-      <w:r>
-        <w:rPr>
-          <w:rtl w:val="0"/>
-        </w:rPr>
-        <w:t xml:space="preserve">Creamos el directorio “entregable” donde vamos a trabajar. Le asociamos un repositorio git y configuramos el nombre y el email.</w:t>
-      </w:r>
-    </w:p>
-    <w:p>
-      <w:pPr>
-        <w:ind w:left="720" w:firstLine="0"/>
-        <w:rPr/>
-      </w:pPr>
-      <w:r>
-        <w:rPr>
-          <w:rtl w:val="0"/>
-        </w:rPr>
-      </w:r>
-    </w:p>
-    <w:p>
-      <w:pPr>
-        <w:pStyle w:val="Heading2"/>
+    </w:p>
+    <w:p>
+      <w:pPr>
+        <w:ind w:left="720"/>
+      </w:pPr>
+      <w:r>
+        <w:t xml:space="preserve">Creamos el directorio “entregable” donde vamos a trabajar. Le asociamos un repositorio </w:t>
+      </w:r>
+      <w:proofErr w:type="spellStart"/>
+      <w:r>
+        <w:t>git</w:t>
+      </w:r>
+      <w:proofErr w:type="spellEnd"/>
+      <w:r>
+        <w:t xml:space="preserve"> y configuramos el nombre y el email.</w:t>
+      </w:r>
+    </w:p>
+    <w:p>
+      <w:pPr>
+        <w:ind w:left="720"/>
+      </w:pPr>
+    </w:p>
+    <w:p>
+      <w:pPr>
+        <w:pStyle w:val="Ttulo2"/>
         <w:numPr>
           <w:ilvl w:val="0"/>
           <w:numId w:val="1"/>
         </w:numPr>
-        <w:ind w:left="720" w:hanging="360"/>
-        <w:rPr/>
-      </w:pPr>
-      <w:bookmarkStart w:colFirst="0" w:colLast="0" w:name="_gxc8ui90mbyy" w:id="3"/>
+      </w:pPr>
+      <w:bookmarkStart w:id="3" w:name="_gxc8ui90mbyy" w:colFirst="0" w:colLast="0"/>
       <w:bookmarkEnd w:id="3"/>
+      <w:proofErr w:type="spellStart"/>
+      <w:r>
+        <w:t>Creacion</w:t>
+      </w:r>
+      <w:proofErr w:type="spellEnd"/>
+      <w:r>
+        <w:t xml:space="preserve"> del entorno virtual de </w:t>
+      </w:r>
+      <w:proofErr w:type="spellStart"/>
+      <w:r>
+        <w:t>python</w:t>
+      </w:r>
+      <w:proofErr w:type="spellEnd"/>
+    </w:p>
+    <w:p>
+      <w:pPr>
+        <w:ind w:left="720"/>
+      </w:pPr>
       <w:r>
         <w:rPr>
-          <w:rtl w:val="0"/>
+          <w:noProof/>
         </w:rPr>
-        <w:t xml:space="preserve">Creacion del entorno virtual de python</w:t>
-      </w:r>
-    </w:p>
-    <w:p>
-      <w:pPr>
-        <w:ind w:left="720" w:firstLine="0"/>
-        <w:rPr/>
-      </w:pPr>
-      <w:r>
-        <w:rPr/>
         <w:drawing>
-          <wp:inline distB="114300" distT="114300" distL="114300" distR="114300">
+          <wp:inline distT="114300" distB="114300" distL="114300" distR="114300" wp14:anchorId="3833290B" wp14:editId="1DBA66DC">
             <wp:extent cx="5731200" cy="241300"/>
-            <wp:effectExtent b="0" l="0" r="0" t="0"/>
+            <wp:effectExtent l="0" t="0" r="0" b="0"/>
             <wp:docPr id="3" name="image7.png"/>
-            <a:graphic>
+            <wp:cNvGraphicFramePr/>
+            <a:graphic xmlns:a="http://schemas.openxmlformats.org/drawingml/2006/main">
               <a:graphicData uri="http://schemas.openxmlformats.org/drawingml/2006/picture">
-                <pic:pic>
+                <pic:pic xmlns:pic="http://schemas.openxmlformats.org/drawingml/2006/picture">
                   <pic:nvPicPr>
                     <pic:cNvPr id="0" name="image7.png"/>
                     <pic:cNvPicPr preferRelativeResize="0"/>
                   </pic:nvPicPr>
                   <pic:blipFill>
-                    <a:blip r:embed="rId7"/>
-                    <a:srcRect b="0" l="0" r="0" t="0"/>
+                    <a:blip r:embed="rId6"/>
+                    <a:srcRect/>
                     <a:stretch>
                       <a:fillRect/>
                     </a:stretch>
@@ -170,7 +172,9 @@
                       <a:off x="0" y="0"/>
                       <a:ext cx="5731200" cy="241300"/>
                     </a:xfrm>
-                    <a:prstGeom prst="rect"/>
+                    <a:prstGeom prst="rect">
+                      <a:avLst/>
+                    </a:prstGeom>
                     <a:ln/>
                   </pic:spPr>
                 </pic:pic>
@@ -179,34 +183,31 @@
           </wp:inline>
         </w:drawing>
       </w:r>
+    </w:p>
+    <w:p>
+      <w:pPr>
+        <w:ind w:left="720"/>
+      </w:pPr>
       <w:r>
         <w:rPr>
-          <w:rtl w:val="0"/>
+          <w:noProof/>
         </w:rPr>
-      </w:r>
-    </w:p>
-    <w:p>
-      <w:pPr>
-        <w:ind w:left="720" w:firstLine="0"/>
-        <w:rPr/>
-      </w:pPr>
-      <w:r>
-        <w:rPr/>
         <w:drawing>
-          <wp:inline distB="114300" distT="114300" distL="114300" distR="114300">
+          <wp:inline distT="114300" distB="114300" distL="114300" distR="114300" wp14:anchorId="1308D3ED" wp14:editId="54B6E1F2">
             <wp:extent cx="5731200" cy="165100"/>
-            <wp:effectExtent b="0" l="0" r="0" t="0"/>
+            <wp:effectExtent l="0" t="0" r="0" b="0"/>
             <wp:docPr id="8" name="image6.png"/>
-            <a:graphic>
+            <wp:cNvGraphicFramePr/>
+            <a:graphic xmlns:a="http://schemas.openxmlformats.org/drawingml/2006/main">
               <a:graphicData uri="http://schemas.openxmlformats.org/drawingml/2006/picture">
-                <pic:pic>
+                <pic:pic xmlns:pic="http://schemas.openxmlformats.org/drawingml/2006/picture">
                   <pic:nvPicPr>
                     <pic:cNvPr id="0" name="image6.png"/>
                     <pic:cNvPicPr preferRelativeResize="0"/>
                   </pic:nvPicPr>
                   <pic:blipFill>
-                    <a:blip r:embed="rId8"/>
-                    <a:srcRect b="0" l="0" r="0" t="0"/>
+                    <a:blip r:embed="rId7"/>
+                    <a:srcRect/>
                     <a:stretch>
                       <a:fillRect/>
                     </a:stretch>
@@ -216,7 +217,9 @@
                       <a:off x="0" y="0"/>
                       <a:ext cx="5731200" cy="165100"/>
                     </a:xfrm>
-                    <a:prstGeom prst="rect"/>
+                    <a:prstGeom prst="rect">
+                      <a:avLst/>
+                    </a:prstGeom>
                     <a:ln/>
                   </pic:spPr>
                 </pic:pic>
@@ -225,46 +228,47 @@
           </wp:inline>
         </w:drawing>
       </w:r>
+    </w:p>
+    <w:p>
+      <w:pPr>
+        <w:ind w:left="720"/>
+      </w:pPr>
+      <w:r>
+        <w:t xml:space="preserve">Hemos creado el entorno virtual de </w:t>
+      </w:r>
+      <w:proofErr w:type="spellStart"/>
+      <w:r>
+        <w:t>python</w:t>
+      </w:r>
+      <w:proofErr w:type="spellEnd"/>
+      <w:r>
+        <w:t xml:space="preserve"> en el que vamos a trabajar.</w:t>
+      </w:r>
+    </w:p>
+    <w:p>
+      <w:pPr>
+        <w:ind w:left="720"/>
+      </w:pPr>
       <w:r>
         <w:rPr>
-          <w:rtl w:val="0"/>
+          <w:noProof/>
         </w:rPr>
-      </w:r>
-    </w:p>
-    <w:p>
-      <w:pPr>
-        <w:ind w:left="720" w:firstLine="0"/>
-        <w:rPr/>
-      </w:pPr>
-      <w:r>
-        <w:rPr>
-          <w:rtl w:val="0"/>
-        </w:rPr>
-        <w:t xml:space="preserve">Hemos creado el entorno virtual de python en el que vamos a trabajar.</w:t>
-      </w:r>
-    </w:p>
-    <w:p>
-      <w:pPr>
-        <w:ind w:left="720" w:firstLine="0"/>
-        <w:rPr/>
-      </w:pPr>
-      <w:r>
-        <w:rPr/>
         <w:drawing>
-          <wp:inline distB="114300" distT="114300" distL="114300" distR="114300">
+          <wp:inline distT="114300" distB="114300" distL="114300" distR="114300" wp14:anchorId="0706D942" wp14:editId="2CC97260">
             <wp:extent cx="5731200" cy="3263900"/>
-            <wp:effectExtent b="0" l="0" r="0" t="0"/>
+            <wp:effectExtent l="0" t="0" r="0" b="0"/>
             <wp:docPr id="6" name="image9.png"/>
-            <a:graphic>
+            <wp:cNvGraphicFramePr/>
+            <a:graphic xmlns:a="http://schemas.openxmlformats.org/drawingml/2006/main">
               <a:graphicData uri="http://schemas.openxmlformats.org/drawingml/2006/picture">
-                <pic:pic>
+                <pic:pic xmlns:pic="http://schemas.openxmlformats.org/drawingml/2006/picture">
                   <pic:nvPicPr>
                     <pic:cNvPr id="0" name="image9.png"/>
                     <pic:cNvPicPr preferRelativeResize="0"/>
                   </pic:nvPicPr>
                   <pic:blipFill>
-                    <a:blip r:embed="rId9"/>
-                    <a:srcRect b="0" l="0" r="0" t="0"/>
+                    <a:blip r:embed="rId8"/>
+                    <a:srcRect/>
                     <a:stretch>
                       <a:fillRect/>
                     </a:stretch>
@@ -274,7 +278,9 @@
                       <a:off x="0" y="0"/>
                       <a:ext cx="5731200" cy="3263900"/>
                     </a:xfrm>
-                    <a:prstGeom prst="rect"/>
+                    <a:prstGeom prst="rect">
+                      <a:avLst/>
+                    </a:prstGeom>
                     <a:ln/>
                   </pic:spPr>
                 </pic:pic>
@@ -283,46 +289,56 @@
           </wp:inline>
         </w:drawing>
       </w:r>
+    </w:p>
+    <w:p>
+      <w:pPr>
+        <w:ind w:left="720"/>
+      </w:pPr>
+      <w:r>
+        <w:t xml:space="preserve">Nos aseguramos de que estamos en nuestro entorno de </w:t>
+      </w:r>
+      <w:proofErr w:type="spellStart"/>
+      <w:r>
+        <w:t>python</w:t>
+      </w:r>
+      <w:proofErr w:type="spellEnd"/>
+      <w:r>
+        <w:t xml:space="preserve">. Y ahora instalamos el módulo </w:t>
+      </w:r>
+      <w:proofErr w:type="spellStart"/>
+      <w:r>
+        <w:t>pytest</w:t>
+      </w:r>
+      <w:proofErr w:type="spellEnd"/>
+      <w:r>
+        <w:t>:</w:t>
+      </w:r>
+    </w:p>
+    <w:p>
+      <w:pPr>
+        <w:ind w:left="720"/>
+      </w:pPr>
       <w:r>
         <w:rPr>
-          <w:rtl w:val="0"/>
+          <w:noProof/>
         </w:rPr>
-      </w:r>
-    </w:p>
-    <w:p>
-      <w:pPr>
-        <w:ind w:left="720" w:firstLine="0"/>
-        <w:rPr/>
-      </w:pPr>
-      <w:r>
-        <w:rPr>
-          <w:rtl w:val="0"/>
-        </w:rPr>
-        <w:t xml:space="preserve">Nos aseguramos de que estamos en nuestro entorno de python. Y ahora instalamos el módulo pytest:</w:t>
-      </w:r>
-    </w:p>
-    <w:p>
-      <w:pPr>
-        <w:ind w:left="720" w:firstLine="0"/>
-        <w:rPr/>
-      </w:pPr>
-      <w:r>
-        <w:rPr/>
+        <w:lastRenderedPageBreak/>
         <w:drawing>
-          <wp:inline distB="114300" distT="114300" distL="114300" distR="114300">
+          <wp:inline distT="114300" distB="114300" distL="114300" distR="114300" wp14:anchorId="47358598" wp14:editId="6B530550">
             <wp:extent cx="5731200" cy="1701800"/>
-            <wp:effectExtent b="0" l="0" r="0" t="0"/>
+            <wp:effectExtent l="0" t="0" r="0" b="0"/>
             <wp:docPr id="2" name="image3.png"/>
-            <a:graphic>
+            <wp:cNvGraphicFramePr/>
+            <a:graphic xmlns:a="http://schemas.openxmlformats.org/drawingml/2006/main">
               <a:graphicData uri="http://schemas.openxmlformats.org/drawingml/2006/picture">
-                <pic:pic>
+                <pic:pic xmlns:pic="http://schemas.openxmlformats.org/drawingml/2006/picture">
                   <pic:nvPicPr>
                     <pic:cNvPr id="0" name="image3.png"/>
                     <pic:cNvPicPr preferRelativeResize="0"/>
                   </pic:nvPicPr>
                   <pic:blipFill>
-                    <a:blip r:embed="rId10"/>
-                    <a:srcRect b="0" l="0" r="0" t="0"/>
+                    <a:blip r:embed="rId9"/>
+                    <a:srcRect/>
                     <a:stretch>
                       <a:fillRect/>
                     </a:stretch>
@@ -332,7 +348,9 @@
                       <a:off x="0" y="0"/>
                       <a:ext cx="5731200" cy="1701800"/>
                     </a:xfrm>
-                    <a:prstGeom prst="rect"/>
+                    <a:prstGeom prst="rect">
+                      <a:avLst/>
+                    </a:prstGeom>
                     <a:ln/>
                   </pic:spPr>
                 </pic:pic>
@@ -341,76 +359,63 @@
           </wp:inline>
         </w:drawing>
       </w:r>
-      <w:r>
-        <w:rPr>
-          <w:rtl w:val="0"/>
-        </w:rPr>
-      </w:r>
-    </w:p>
-    <w:p>
-      <w:pPr>
-        <w:ind w:left="720" w:firstLine="0"/>
-        <w:rPr/>
-      </w:pPr>
-      <w:r>
-        <w:rPr>
-          <w:rtl w:val="0"/>
-        </w:rPr>
-      </w:r>
-    </w:p>
-    <w:p>
-      <w:pPr>
-        <w:pStyle w:val="Heading2"/>
+    </w:p>
+    <w:p>
+      <w:pPr>
+        <w:ind w:left="720"/>
+      </w:pPr>
+    </w:p>
+    <w:p>
+      <w:pPr>
+        <w:pStyle w:val="Ttulo2"/>
         <w:numPr>
           <w:ilvl w:val="0"/>
           <w:numId w:val="1"/>
         </w:numPr>
-        <w:ind w:left="720" w:hanging="360"/>
-        <w:rPr/>
-      </w:pPr>
-      <w:bookmarkStart w:colFirst="0" w:colLast="0" w:name="_uoinp0a76jmv" w:id="4"/>
+      </w:pPr>
+      <w:bookmarkStart w:id="4" w:name="_uoinp0a76jmv" w:colFirst="0" w:colLast="0"/>
       <w:bookmarkEnd w:id="4"/>
       <w:r>
+        <w:t xml:space="preserve">Repositorio remoto en </w:t>
+      </w:r>
+      <w:proofErr w:type="spellStart"/>
+      <w:r>
+        <w:t>GitHbub</w:t>
+      </w:r>
+      <w:proofErr w:type="spellEnd"/>
+    </w:p>
+    <w:p>
+      <w:pPr>
+        <w:ind w:left="720"/>
+      </w:pPr>
+      <w:r>
+        <w:t>Creamos un Repositorio remoto en GitHub</w:t>
+      </w:r>
+    </w:p>
+    <w:p>
+      <w:pPr>
+        <w:ind w:left="720"/>
+      </w:pPr>
+      <w:r>
         <w:rPr>
-          <w:rtl w:val="0"/>
+          <w:noProof/>
         </w:rPr>
-        <w:t xml:space="preserve">Repositorio remoto en GitHbub</w:t>
-      </w:r>
-    </w:p>
-    <w:p>
-      <w:pPr>
-        <w:ind w:left="720" w:firstLine="0"/>
-        <w:rPr/>
-      </w:pPr>
-      <w:r>
-        <w:rPr>
-          <w:rtl w:val="0"/>
-        </w:rPr>
-        <w:t xml:space="preserve">Creamos un Repositorio remoto en GitHub</w:t>
-      </w:r>
-    </w:p>
-    <w:p>
-      <w:pPr>
-        <w:ind w:left="720" w:firstLine="0"/>
-        <w:rPr/>
-      </w:pPr>
-      <w:r>
-        <w:rPr/>
         <w:drawing>
-          <wp:inline distB="114300" distT="114300" distL="114300" distR="114300">
+          <wp:inline distT="114300" distB="114300" distL="114300" distR="114300" wp14:anchorId="6AFFB9E2" wp14:editId="6F8AFBA0">
             <wp:extent cx="5731200" cy="2997200"/>
-            <wp:effectExtent b="0" l="0" r="0" t="0"/>
+            <wp:effectExtent l="0" t="0" r="0" b="0"/>
             <wp:docPr id="4" name="image1.png"/>
-            <a:graphic>
+            <wp:cNvGraphicFramePr/>
+            <a:graphic xmlns:a="http://schemas.openxmlformats.org/drawingml/2006/main">
               <a:graphicData uri="http://schemas.openxmlformats.org/drawingml/2006/picture">
-                <pic:pic>
+                <pic:pic xmlns:pic="http://schemas.openxmlformats.org/drawingml/2006/picture">
                   <pic:nvPicPr>
                     <pic:cNvPr id="0" name="image1.png"/>
                     <pic:cNvPicPr preferRelativeResize="0"/>
                   </pic:nvPicPr>
                   <pic:blipFill>
-                    <a:blip r:embed="rId11"/>
-                    <a:srcRect b="0" l="0" r="0" t="0"/>
+                    <a:blip r:embed="rId10"/>
+                    <a:srcRect/>
                     <a:stretch>
                       <a:fillRect/>
                     </a:stretch>
@@ -420,7 +425,9 @@
                       <a:off x="0" y="0"/>
                       <a:ext cx="5731200" cy="2997200"/>
                     </a:xfrm>
-                    <a:prstGeom prst="rect"/>
+                    <a:prstGeom prst="rect">
+                      <a:avLst/>
+                    </a:prstGeom>
                     <a:ln/>
                   </pic:spPr>
                 </pic:pic>
@@ -429,46 +436,48 @@
           </wp:inline>
         </w:drawing>
       </w:r>
+    </w:p>
+    <w:p>
+      <w:pPr>
+        <w:ind w:left="720"/>
+      </w:pPr>
+      <w:r>
+        <w:t xml:space="preserve">Lo siguiente es preparar los archivos y cambios de nuestra carpeta para subirlos a </w:t>
+      </w:r>
+      <w:proofErr w:type="spellStart"/>
+      <w:r>
+        <w:t>github</w:t>
+      </w:r>
+      <w:proofErr w:type="spellEnd"/>
+      <w:r>
+        <w:t>:</w:t>
+      </w:r>
+    </w:p>
+    <w:p>
+      <w:pPr>
+        <w:ind w:left="720"/>
+      </w:pPr>
       <w:r>
         <w:rPr>
-          <w:rtl w:val="0"/>
+          <w:noProof/>
         </w:rPr>
-      </w:r>
-    </w:p>
-    <w:p>
-      <w:pPr>
-        <w:ind w:left="720" w:firstLine="0"/>
-        <w:rPr/>
-      </w:pPr>
-      <w:r>
-        <w:rPr>
-          <w:rtl w:val="0"/>
-        </w:rPr>
-        <w:t xml:space="preserve">Lo siguiente es preparar los archivos y cambios de nuestra carpeta para subirlos a github:</w:t>
-      </w:r>
-    </w:p>
-    <w:p>
-      <w:pPr>
-        <w:ind w:left="720" w:firstLine="0"/>
-        <w:rPr/>
-      </w:pPr>
-      <w:r>
-        <w:rPr/>
+        <w:lastRenderedPageBreak/>
         <w:drawing>
-          <wp:inline distB="114300" distT="114300" distL="114300" distR="114300">
+          <wp:inline distT="114300" distB="114300" distL="114300" distR="114300" wp14:anchorId="41E411F3" wp14:editId="6591759C">
             <wp:extent cx="5731200" cy="2959100"/>
-            <wp:effectExtent b="0" l="0" r="0" t="0"/>
+            <wp:effectExtent l="0" t="0" r="0" b="0"/>
             <wp:docPr id="9" name="image8.png"/>
-            <a:graphic>
+            <wp:cNvGraphicFramePr/>
+            <a:graphic xmlns:a="http://schemas.openxmlformats.org/drawingml/2006/main">
               <a:graphicData uri="http://schemas.openxmlformats.org/drawingml/2006/picture">
-                <pic:pic>
+                <pic:pic xmlns:pic="http://schemas.openxmlformats.org/drawingml/2006/picture">
                   <pic:nvPicPr>
                     <pic:cNvPr id="0" name="image8.png"/>
                     <pic:cNvPicPr preferRelativeResize="0"/>
                   </pic:nvPicPr>
                   <pic:blipFill>
-                    <a:blip r:embed="rId12"/>
-                    <a:srcRect b="0" l="0" r="0" t="0"/>
+                    <a:blip r:embed="rId11"/>
+                    <a:srcRect/>
                     <a:stretch>
                       <a:fillRect/>
                     </a:stretch>
@@ -478,7 +487,9 @@
                       <a:off x="0" y="0"/>
                       <a:ext cx="5731200" cy="2959100"/>
                     </a:xfrm>
-                    <a:prstGeom prst="rect"/>
+                    <a:prstGeom prst="rect">
+                      <a:avLst/>
+                    </a:prstGeom>
                     <a:ln/>
                   </pic:spPr>
                 </pic:pic>
@@ -487,57 +498,52 @@
           </wp:inline>
         </w:drawing>
       </w:r>
+    </w:p>
+    <w:p>
+      <w:pPr>
+        <w:ind w:left="720"/>
+      </w:pPr>
+    </w:p>
+    <w:p>
+      <w:pPr>
+        <w:ind w:left="720"/>
+      </w:pPr>
+      <w:r>
+        <w:t xml:space="preserve">Ahora sincronizamos nuestra carpeta en nuestro ordenador con este repositorio que hemos creado en </w:t>
+      </w:r>
+      <w:proofErr w:type="spellStart"/>
+      <w:r>
+        <w:t>github</w:t>
+      </w:r>
+      <w:proofErr w:type="spellEnd"/>
+      <w:r>
+        <w:t xml:space="preserve"> mediante los comandos:</w:t>
+      </w:r>
+    </w:p>
+    <w:p>
+      <w:pPr>
+        <w:ind w:left="720"/>
+      </w:pPr>
       <w:r>
         <w:rPr>
-          <w:rtl w:val="0"/>
+          <w:noProof/>
         </w:rPr>
-      </w:r>
-    </w:p>
-    <w:p>
-      <w:pPr>
-        <w:ind w:left="720" w:firstLine="0"/>
-        <w:rPr/>
-      </w:pPr>
-      <w:r>
-        <w:rPr>
-          <w:rtl w:val="0"/>
-        </w:rPr>
-      </w:r>
-    </w:p>
-    <w:p>
-      <w:pPr>
-        <w:ind w:left="720" w:firstLine="0"/>
-        <w:rPr/>
-      </w:pPr>
-      <w:r>
-        <w:rPr>
-          <w:rtl w:val="0"/>
-        </w:rPr>
-        <w:t xml:space="preserve">Ahora sincronizamos nuestra carpeta en nuestro ordenador con este repositorio que hemos creado en github mediante los comandos:</w:t>
-      </w:r>
-    </w:p>
-    <w:p>
-      <w:pPr>
-        <w:ind w:left="720" w:firstLine="0"/>
-        <w:rPr/>
-      </w:pPr>
-      <w:r>
-        <w:rPr/>
         <w:drawing>
-          <wp:inline distB="114300" distT="114300" distL="114300" distR="114300">
+          <wp:inline distT="114300" distB="114300" distL="114300" distR="114300" wp14:anchorId="1859D5D0" wp14:editId="496C54DE">
             <wp:extent cx="5731200" cy="1638300"/>
-            <wp:effectExtent b="0" l="0" r="0" t="0"/>
+            <wp:effectExtent l="0" t="0" r="0" b="0"/>
             <wp:docPr id="5" name="image2.png"/>
-            <a:graphic>
+            <wp:cNvGraphicFramePr/>
+            <a:graphic xmlns:a="http://schemas.openxmlformats.org/drawingml/2006/main">
               <a:graphicData uri="http://schemas.openxmlformats.org/drawingml/2006/picture">
-                <pic:pic>
+                <pic:pic xmlns:pic="http://schemas.openxmlformats.org/drawingml/2006/picture">
                   <pic:nvPicPr>
                     <pic:cNvPr id="0" name="image2.png"/>
                     <pic:cNvPicPr preferRelativeResize="0"/>
                   </pic:nvPicPr>
                   <pic:blipFill>
-                    <a:blip r:embed="rId13"/>
-                    <a:srcRect b="0" l="0" r="0" t="0"/>
+                    <a:blip r:embed="rId12"/>
+                    <a:srcRect/>
                     <a:stretch>
                       <a:fillRect/>
                     </a:stretch>
@@ -547,7 +553,9 @@
                       <a:off x="0" y="0"/>
                       <a:ext cx="5731200" cy="1638300"/>
                     </a:xfrm>
-                    <a:prstGeom prst="rect"/>
+                    <a:prstGeom prst="rect">
+                      <a:avLst/>
+                    </a:prstGeom>
                     <a:ln/>
                   </pic:spPr>
                 </pic:pic>
@@ -556,46 +564,56 @@
           </wp:inline>
         </w:drawing>
       </w:r>
+    </w:p>
+    <w:p>
+      <w:pPr>
+        <w:ind w:left="720"/>
+      </w:pPr>
+      <w:r>
+        <w:t xml:space="preserve">Y nos aseguramos de que en nuestro repositorio de </w:t>
+      </w:r>
+      <w:proofErr w:type="spellStart"/>
+      <w:r>
+        <w:t>git</w:t>
+      </w:r>
+      <w:proofErr w:type="spellEnd"/>
+      <w:r>
+        <w:t xml:space="preserve"> está todo bien subido con el mensaje del </w:t>
+      </w:r>
+      <w:proofErr w:type="spellStart"/>
+      <w:r>
+        <w:t>commit</w:t>
+      </w:r>
+      <w:proofErr w:type="spellEnd"/>
+      <w:r>
+        <w:t>:</w:t>
+      </w:r>
+    </w:p>
+    <w:p>
+      <w:pPr>
+        <w:ind w:left="720"/>
+      </w:pPr>
       <w:r>
         <w:rPr>
-          <w:rtl w:val="0"/>
+          <w:noProof/>
         </w:rPr>
-      </w:r>
-    </w:p>
-    <w:p>
-      <w:pPr>
-        <w:ind w:left="720" w:firstLine="0"/>
-        <w:rPr/>
-      </w:pPr>
-      <w:r>
-        <w:rPr>
-          <w:rtl w:val="0"/>
-        </w:rPr>
-        <w:t xml:space="preserve">Y nos aseguramos de que en nuestro repositorio de git está todo bien subido con el mensaje del commit:</w:t>
-      </w:r>
-    </w:p>
-    <w:p>
-      <w:pPr>
-        <w:ind w:left="720" w:firstLine="0"/>
-        <w:rPr/>
-      </w:pPr>
-      <w:r>
-        <w:rPr/>
+        <w:lastRenderedPageBreak/>
         <w:drawing>
-          <wp:inline distB="114300" distT="114300" distL="114300" distR="114300">
+          <wp:inline distT="114300" distB="114300" distL="114300" distR="114300" wp14:anchorId="5C00AD5A" wp14:editId="21073455">
             <wp:extent cx="5731200" cy="5689600"/>
-            <wp:effectExtent b="0" l="0" r="0" t="0"/>
+            <wp:effectExtent l="0" t="0" r="0" b="0"/>
             <wp:docPr id="7" name="image4.png"/>
-            <a:graphic>
+            <wp:cNvGraphicFramePr/>
+            <a:graphic xmlns:a="http://schemas.openxmlformats.org/drawingml/2006/main">
               <a:graphicData uri="http://schemas.openxmlformats.org/drawingml/2006/picture">
-                <pic:pic>
+                <pic:pic xmlns:pic="http://schemas.openxmlformats.org/drawingml/2006/picture">
                   <pic:nvPicPr>
                     <pic:cNvPr id="0" name="image4.png"/>
                     <pic:cNvPicPr preferRelativeResize="0"/>
                   </pic:nvPicPr>
                   <pic:blipFill>
-                    <a:blip r:embed="rId14"/>
-                    <a:srcRect b="0" l="0" r="0" t="0"/>
+                    <a:blip r:embed="rId13"/>
+                    <a:srcRect/>
                     <a:stretch>
                       <a:fillRect/>
                     </a:stretch>
@@ -605,7 +623,9 @@
                       <a:off x="0" y="0"/>
                       <a:ext cx="5731200" cy="5689600"/>
                     </a:xfrm>
-                    <a:prstGeom prst="rect"/>
+                    <a:prstGeom prst="rect">
+                      <a:avLst/>
+                    </a:prstGeom>
                     <a:ln/>
                   </pic:spPr>
                 </pic:pic>
@@ -614,69 +634,148 @@
           </wp:inline>
         </w:drawing>
       </w:r>
-      <w:r>
-        <w:rPr>
-          <w:rtl w:val="0"/>
-        </w:rPr>
-      </w:r>
-    </w:p>
-    <w:p>
-      <w:pPr>
-        <w:ind w:left="720" w:firstLine="0"/>
-        <w:rPr/>
-      </w:pPr>
-      <w:r>
-        <w:rPr>
-          <w:rtl w:val="0"/>
-        </w:rPr>
-      </w:r>
-    </w:p>
-    <w:p>
-      <w:pPr>
-        <w:ind w:left="720" w:firstLine="0"/>
-        <w:rPr/>
-      </w:pPr>
-      <w:r>
-        <w:rPr>
-          <w:rtl w:val="0"/>
-        </w:rPr>
-        <w:t xml:space="preserve">Ahora estamos listos para empezar a programar MiImperio.py</w:t>
-      </w:r>
-    </w:p>
-    <w:p>
-      <w:pPr>
-        <w:ind w:left="720" w:firstLine="0"/>
-        <w:rPr/>
-      </w:pPr>
-      <w:r>
-        <w:rPr>
-          <w:rtl w:val="0"/>
-        </w:rPr>
-      </w:r>
-    </w:p>
-    <w:p>
-      <w:pPr>
-        <w:ind w:left="720" w:firstLine="0"/>
-        <w:rPr/>
-      </w:pPr>
-      <w:r>
-        <w:rPr>
-          <w:rtl w:val="0"/>
-        </w:rPr>
-      </w:r>
+    </w:p>
+    <w:p>
+      <w:pPr>
+        <w:ind w:left="720"/>
+      </w:pPr>
+    </w:p>
+    <w:p>
+      <w:pPr>
+        <w:ind w:left="720"/>
+      </w:pPr>
+      <w:r>
+        <w:t>Ahora estamos listos para empezar a programar MiImperio.py</w:t>
+      </w:r>
+    </w:p>
+    <w:p>
+      <w:pPr>
+        <w:ind w:left="720"/>
+      </w:pPr>
+    </w:p>
+    <w:p>
+      <w:pPr>
+        <w:pStyle w:val="Ttulo2"/>
+        <w:numPr>
+          <w:ilvl w:val="0"/>
+          <w:numId w:val="1"/>
+        </w:numPr>
+      </w:pPr>
+      <w:r>
+        <w:t>Control de ramas</w:t>
+      </w:r>
+    </w:p>
+    <w:p>
+      <w:r>
+        <w:drawing>
+          <wp:inline distT="0" distB="0" distL="0" distR="0" wp14:anchorId="67FDAECC" wp14:editId="1F957533">
+            <wp:extent cx="5733415" cy="1842135"/>
+            <wp:effectExtent l="0" t="0" r="635" b="5715"/>
+            <wp:docPr id="1642149770" name="Imagen 1"/>
+            <wp:cNvGraphicFramePr>
+              <a:graphicFrameLocks xmlns:a="http://schemas.openxmlformats.org/drawingml/2006/main" noChangeAspect="1"/>
+            </wp:cNvGraphicFramePr>
+            <a:graphic xmlns:a="http://schemas.openxmlformats.org/drawingml/2006/main">
+              <a:graphicData uri="http://schemas.openxmlformats.org/drawingml/2006/picture">
+                <pic:pic xmlns:pic="http://schemas.openxmlformats.org/drawingml/2006/picture">
+                  <pic:nvPicPr>
+                    <pic:cNvPr id="1642149770" name=""/>
+                    <pic:cNvPicPr/>
+                  </pic:nvPicPr>
+                  <pic:blipFill>
+                    <a:blip r:embed="rId14"/>
+                    <a:stretch>
+                      <a:fillRect/>
+                    </a:stretch>
+                  </pic:blipFill>
+                  <pic:spPr>
+                    <a:xfrm>
+                      <a:off x="0" y="0"/>
+                      <a:ext cx="5733415" cy="1842135"/>
+                    </a:xfrm>
+                    <a:prstGeom prst="rect">
+                      <a:avLst/>
+                    </a:prstGeom>
+                  </pic:spPr>
+                </pic:pic>
+              </a:graphicData>
+            </a:graphic>
+          </wp:inline>
+        </w:drawing>
+      </w:r>
+    </w:p>
+    <w:p>
+      <w:r>
+        <w:lastRenderedPageBreak/>
+        <w:t>Hemos creado una nueva rama donde vamos a trabajar.</w:t>
+      </w:r>
+    </w:p>
+    <w:p>
+      <w:r>
+        <w:drawing>
+          <wp:inline distT="0" distB="0" distL="0" distR="0" wp14:anchorId="37B85FE8" wp14:editId="49661292">
+            <wp:extent cx="5733415" cy="1434465"/>
+            <wp:effectExtent l="0" t="0" r="635" b="0"/>
+            <wp:docPr id="100293362" name="Imagen 1"/>
+            <wp:cNvGraphicFramePr>
+              <a:graphicFrameLocks xmlns:a="http://schemas.openxmlformats.org/drawingml/2006/main" noChangeAspect="1"/>
+            </wp:cNvGraphicFramePr>
+            <a:graphic xmlns:a="http://schemas.openxmlformats.org/drawingml/2006/main">
+              <a:graphicData uri="http://schemas.openxmlformats.org/drawingml/2006/picture">
+                <pic:pic xmlns:pic="http://schemas.openxmlformats.org/drawingml/2006/picture">
+                  <pic:nvPicPr>
+                    <pic:cNvPr id="100293362" name=""/>
+                    <pic:cNvPicPr/>
+                  </pic:nvPicPr>
+                  <pic:blipFill>
+                    <a:blip r:embed="rId15"/>
+                    <a:stretch>
+                      <a:fillRect/>
+                    </a:stretch>
+                  </pic:blipFill>
+                  <pic:spPr>
+                    <a:xfrm>
+                      <a:off x="0" y="0"/>
+                      <a:ext cx="5733415" cy="1434465"/>
+                    </a:xfrm>
+                    <a:prstGeom prst="rect">
+                      <a:avLst/>
+                    </a:prstGeom>
+                  </pic:spPr>
+                </pic:pic>
+              </a:graphicData>
+            </a:graphic>
+          </wp:inline>
+        </w:drawing>
+      </w:r>
+    </w:p>
+    <w:p/>
+    <w:p>
+      <w:pPr>
+        <w:ind w:left="720"/>
+      </w:pPr>
+    </w:p>
+    <w:p>
+      <w:pPr>
+        <w:ind w:left="720"/>
+      </w:pPr>
     </w:p>
     <w:sectPr>
-      <w:pgSz w:h="16834" w:w="11909" w:orient="portrait"/>
-      <w:pgMar w:bottom="1440" w:top="1440" w:left="1440" w:right="1440" w:header="720" w:footer="720"/>
+      <w:pgSz w:w="11909" w:h="16834"/>
+      <w:pgMar w:top="1440" w:right="1440" w:bottom="1440" w:left="1440" w:header="720" w:footer="720" w:gutter="0"/>
       <w:pgNumType w:start="1"/>
+      <w:cols w:space="720"/>
     </w:sectPr>
   </w:body>
 </w:document>
 </file>
 
 <file path=word/numbering.xml><?xml version="1.0" encoding="utf-8"?>
-<w:numbering xmlns:mc="http://schemas.openxmlformats.org/markup-compatibility/2006" xmlns:o="urn:schemas-microsoft-com:office:office" xmlns:r="http://schemas.openxmlformats.org/officeDocument/2006/relationships" xmlns:m="http://schemas.openxmlformats.org/officeDocument/2006/math" xmlns:v="urn:schemas-microsoft-com:vml" xmlns:wp="http://schemas.openxmlformats.org/drawingml/2006/wordprocessingDrawing" xmlns:w10="urn:schemas-microsoft-com:office:word" xmlns:w="http://schemas.openxmlformats.org/wordprocessingml/2006/main" xmlns:wne="http://schemas.microsoft.com/office/word/2006/wordml" xmlns:sl="http://schemas.openxmlformats.org/schemaLibrary/2006/main" xmlns:a="http://schemas.openxmlformats.org/drawingml/2006/main" xmlns:pic="http://schemas.openxmlformats.org/drawingml/2006/picture" xmlns:c="http://schemas.openxmlformats.org/drawingml/2006/chart" xmlns:lc="http://schemas.openxmlformats.org/drawingml/2006/lockedCanvas" xmlns:dgm="http://schemas.openxmlformats.org/drawingml/2006/diagram" xmlns:wps="http://schemas.microsoft.com/office/word/2010/wordprocessingShape" xmlns:wpg="http://schemas.microsoft.com/office/word/2010/wordprocessingGroup" xmlns:w14="http://schemas.microsoft.com/office/word/2010/wordml" xmlns:w15="http://schemas.microsoft.com/office/word/2012/wordml" xmlns:w16="http://schemas.microsoft.com/office/word/2018/wordml" xmlns:w16cex="http://schemas.microsoft.com/office/word/2018/wordml/cex" xmlns:w16cid="http://schemas.microsoft.com/office/word/2016/wordml/cid" xmlns="http://schemas.microsoft.com/office/tasks/2019/documenttasks" xmlns:cr="http://schemas.microsoft.com/office/comments/2020/reactions">
-  <w:abstractNum w:abstractNumId="1">
+<w:numbering xmlns:wpc="http://schemas.microsoft.com/office/word/2010/wordprocessingCanvas" xmlns:cx="http://schemas.microsoft.com/office/drawing/2014/chartex" xmlns:cx1="http://schemas.microsoft.com/office/drawing/2015/9/8/chartex" xmlns:cx2="http://schemas.microsoft.com/office/drawing/2015/10/21/chartex" xmlns:cx3="http://schemas.microsoft.com/office/drawing/2016/5/9/chartex" xmlns:cx4="http://schemas.microsoft.com/office/drawing/2016/5/10/chartex" xmlns:cx5="http://schemas.microsoft.com/office/drawing/2016/5/11/chartex" xmlns:cx6="http://schemas.microsoft.com/office/drawing/2016/5/12/chartex" xmlns:cx7="http://schemas.microsoft.com/office/drawing/2016/5/13/chartex" xmlns:cx8="http://schemas.microsoft.com/office/drawing/2016/5/14/chartex" xmlns:mc="http://schemas.openxmlformats.org/markup-compatibility/2006" xmlns:aink="http://schemas.microsoft.com/office/drawing/2016/ink" xmlns:am3d="http://schemas.microsoft.com/office/drawing/2017/model3d" xmlns:o="urn:schemas-microsoft-com:office:office" xmlns:oel="http://schemas.microsoft.com/office/2019/extlst" xmlns:r="http://schemas.openxmlformats.org/officeDocument/2006/relationships" xmlns:m="http://schemas.openxmlformats.org/officeDocument/2006/math" xmlns:v="urn:schemas-microsoft-com:vml" xmlns:wp14="http://schemas.microsoft.com/office/word/2010/wordprocessingDrawing" xmlns:wp="http://schemas.openxmlformats.org/drawingml/2006/wordprocessingDrawing" xmlns:w10="urn:schemas-microsoft-com:office:word" xmlns:w="http://schemas.openxmlformats.org/wordprocessingml/2006/main" xmlns:w14="http://schemas.microsoft.com/office/word/2010/wordml" xmlns:w15="http://schemas.microsoft.com/office/word/2012/wordml" xmlns:w16cex="http://schemas.microsoft.com/office/word/2018/wordml/cex" xmlns:w16cid="http://schemas.microsoft.com/office/word/2016/wordml/cid" xmlns:w16="http://schemas.microsoft.com/office/word/2018/wordml" xmlns:w16du="http://schemas.microsoft.com/office/word/2023/wordml/word16du" xmlns:w16sdtdh="http://schemas.microsoft.com/office/word/2020/wordml/sdtdatahash" xmlns:w16sdtfl="http://schemas.microsoft.com/office/word/2024/wordml/sdtformatlock" xmlns:w16se="http://schemas.microsoft.com/office/word/2015/wordml/symex" xmlns:wpg="http://schemas.microsoft.com/office/word/2010/wordprocessingGroup" xmlns:wpi="http://schemas.microsoft.com/office/word/2010/wordprocessingInk" xmlns:wne="http://schemas.microsoft.com/office/word/2006/wordml" xmlns:wps="http://schemas.microsoft.com/office/word/2010/wordprocessingShape" mc:Ignorable="w14 w15 w16se w16cid w16 w16cex w16sdtdh w16sdtfl w16du wp14">
+  <w:abstractNum w:abstractNumId="0" w15:restartNumberingAfterBreak="0">
+    <w:nsid w:val="28311628"/>
+    <w:multiLevelType w:val="multilevel"/>
+    <w:tmpl w:val="90FA45F2"/>
     <w:lvl w:ilvl="0">
       <w:start w:val="1"/>
       <w:numFmt w:val="decimal"/>
@@ -786,21 +885,21 @@
       </w:rPr>
     </w:lvl>
   </w:abstractNum>
-  <w:num w:numId="1">
-    <w:abstractNumId w:val="1"/>
+  <w:num w:numId="1" w16cid:durableId="522400253">
+    <w:abstractNumId w:val="0"/>
   </w:num>
 </w:numbering>
 </file>
 
 <file path=word/styles.xml><?xml version="1.0" encoding="utf-8"?>
-<w:styles xmlns:mc="http://schemas.openxmlformats.org/markup-compatibility/2006" xmlns:o="urn:schemas-microsoft-com:office:office" xmlns:r="http://schemas.openxmlformats.org/officeDocument/2006/relationships" xmlns:m="http://schemas.openxmlformats.org/officeDocument/2006/math" xmlns:v="urn:schemas-microsoft-com:vml" xmlns:wp="http://schemas.openxmlformats.org/drawingml/2006/wordprocessingDrawing" xmlns:w10="urn:schemas-microsoft-com:office:word" xmlns:w="http://schemas.openxmlformats.org/wordprocessingml/2006/main" xmlns:wne="http://schemas.microsoft.com/office/word/2006/wordml" xmlns:sl="http://schemas.openxmlformats.org/schemaLibrary/2006/main" xmlns:a="http://schemas.openxmlformats.org/drawingml/2006/main" xmlns:pic="http://schemas.openxmlformats.org/drawingml/2006/picture" xmlns:c="http://schemas.openxmlformats.org/drawingml/2006/chart" xmlns:lc="http://schemas.openxmlformats.org/drawingml/2006/lockedCanvas" xmlns:dgm="http://schemas.openxmlformats.org/drawingml/2006/diagram" xmlns:wps="http://schemas.microsoft.com/office/word/2010/wordprocessingShape" xmlns:wpg="http://schemas.microsoft.com/office/word/2010/wordprocessingGroup" xmlns:w14="http://schemas.microsoft.com/office/word/2010/wordml" xmlns:w15="http://schemas.microsoft.com/office/word/2012/wordml" xmlns:w16="http://schemas.microsoft.com/office/word/2018/wordml" xmlns:w16cex="http://schemas.microsoft.com/office/word/2018/wordml/cex" xmlns:w16cid="http://schemas.microsoft.com/office/word/2016/wordml/cid" xmlns="http://schemas.microsoft.com/office/tasks/2019/documenttasks" xmlns:cr="http://schemas.microsoft.com/office/comments/2020/reactions">
+<w:styles xmlns:mc="http://schemas.openxmlformats.org/markup-compatibility/2006" xmlns:r="http://schemas.openxmlformats.org/officeDocument/2006/relationships" xmlns:w="http://schemas.openxmlformats.org/wordprocessingml/2006/main" xmlns:w14="http://schemas.microsoft.com/office/word/2010/wordml" xmlns:w15="http://schemas.microsoft.com/office/word/2012/wordml" xmlns:w16cex="http://schemas.microsoft.com/office/word/2018/wordml/cex" xmlns:w16cid="http://schemas.microsoft.com/office/word/2016/wordml/cid" xmlns:w16="http://schemas.microsoft.com/office/word/2018/wordml" xmlns:w16du="http://schemas.microsoft.com/office/word/2023/wordml/word16du" xmlns:w16sdtdh="http://schemas.microsoft.com/office/word/2020/wordml/sdtdatahash" xmlns:w16sdtfl="http://schemas.microsoft.com/office/word/2024/wordml/sdtformatlock" xmlns:w16se="http://schemas.microsoft.com/office/word/2015/wordml/symex" mc:Ignorable="w14 w15 w16se w16cid w16 w16cex w16sdtdh w16sdtfl w16du">
   <w:docDefaults>
     <w:rPrDefault>
       <w:rPr>
-        <w:rFonts w:ascii="Arial" w:cs="Arial" w:eastAsia="Arial" w:hAnsi="Arial"/>
+        <w:rFonts w:ascii="Arial" w:eastAsia="Arial" w:hAnsi="Arial" w:cs="Arial"/>
         <w:sz w:val="22"/>
         <w:szCs w:val="22"/>
-        <w:lang w:val="es"/>
+        <w:lang w:val="es" w:eastAsia="es-ES" w:bidi="ar-SA"/>
       </w:rPr>
     </w:rPrDefault>
     <w:pPrDefault>
@@ -809,79 +908,456 @@
       </w:pPr>
     </w:pPrDefault>
   </w:docDefaults>
-  <w:style w:type="table" w:styleId="TableNormal" w:default="1">
-    <w:name w:val="TableNormal"/>
-    <w:tblPr>
-      <w:tblCellMar>
-        <w:top w:w="100.0" w:type="dxa"/>
-        <w:left w:w="100.0" w:type="dxa"/>
-        <w:bottom w:w="100.0" w:type="dxa"/>
-        <w:right w:w="100.0" w:type="dxa"/>
-      </w:tblCellMar>
-    </w:tblPr>
+  <w:latentStyles w:defLockedState="0" w:defUIPriority="99" w:defSemiHidden="0" w:defUnhideWhenUsed="0" w:defQFormat="0" w:count="376">
+    <w:lsdException w:name="Normal" w:uiPriority="0" w:qFormat="1"/>
+    <w:lsdException w:name="heading 1" w:uiPriority="9" w:qFormat="1"/>
+    <w:lsdException w:name="heading 2" w:semiHidden="1" w:uiPriority="9" w:unhideWhenUsed="1" w:qFormat="1"/>
+    <w:lsdException w:name="heading 3" w:semiHidden="1" w:uiPriority="9" w:unhideWhenUsed="1" w:qFormat="1"/>
+    <w:lsdException w:name="heading 4" w:semiHidden="1" w:uiPriority="9" w:unhideWhenUsed="1" w:qFormat="1"/>
+    <w:lsdException w:name="heading 5" w:semiHidden="1" w:uiPriority="9" w:unhideWhenUsed="1" w:qFormat="1"/>
+    <w:lsdException w:name="heading 6" w:semiHidden="1" w:uiPriority="9" w:unhideWhenUsed="1" w:qFormat="1"/>
+    <w:lsdException w:name="heading 7" w:semiHidden="1" w:uiPriority="9" w:unhideWhenUsed="1" w:qFormat="1"/>
+    <w:lsdException w:name="heading 8" w:semiHidden="1" w:uiPriority="9" w:unhideWhenUsed="1" w:qFormat="1"/>
+    <w:lsdException w:name="heading 9" w:semiHidden="1" w:uiPriority="9" w:unhideWhenUsed="1" w:qFormat="1"/>
+    <w:lsdException w:name="index 1" w:semiHidden="1" w:unhideWhenUsed="1"/>
+    <w:lsdException w:name="index 2" w:semiHidden="1" w:unhideWhenUsed="1"/>
+    <w:lsdException w:name="index 3" w:semiHidden="1" w:unhideWhenUsed="1"/>
+    <w:lsdException w:name="index 4" w:semiHidden="1" w:unhideWhenUsed="1"/>
+    <w:lsdException w:name="index 5" w:semiHidden="1" w:unhideWhenUsed="1"/>
+    <w:lsdException w:name="index 6" w:semiHidden="1" w:unhideWhenUsed="1"/>
+    <w:lsdException w:name="index 7" w:semiHidden="1" w:unhideWhenUsed="1"/>
+    <w:lsdException w:name="index 8" w:semiHidden="1" w:unhideWhenUsed="1"/>
+    <w:lsdException w:name="index 9" w:semiHidden="1" w:unhideWhenUsed="1"/>
+    <w:lsdException w:name="toc 1" w:semiHidden="1" w:uiPriority="39" w:unhideWhenUsed="1"/>
+    <w:lsdException w:name="toc 2" w:semiHidden="1" w:uiPriority="39" w:unhideWhenUsed="1"/>
+    <w:lsdException w:name="toc 3" w:semiHidden="1" w:uiPriority="39" w:unhideWhenUsed="1"/>
+    <w:lsdException w:name="toc 4" w:semiHidden="1" w:uiPriority="39" w:unhideWhenUsed="1"/>
+    <w:lsdException w:name="toc 5" w:semiHidden="1" w:uiPriority="39" w:unhideWhenUsed="1"/>
+    <w:lsdException w:name="toc 6" w:semiHidden="1" w:uiPriority="39" w:unhideWhenUsed="1"/>
+    <w:lsdException w:name="toc 7" w:semiHidden="1" w:uiPriority="39" w:unhideWhenUsed="1"/>
+    <w:lsdException w:name="toc 8" w:semiHidden="1" w:uiPriority="39" w:unhideWhenUsed="1"/>
+    <w:lsdException w:name="toc 9" w:semiHidden="1" w:uiPriority="39" w:unhideWhenUsed="1"/>
+    <w:lsdException w:name="Normal Indent" w:semiHidden="1" w:unhideWhenUsed="1"/>
+    <w:lsdException w:name="footnote text" w:semiHidden="1" w:unhideWhenUsed="1"/>
+    <w:lsdException w:name="annotation text" w:semiHidden="1" w:unhideWhenUsed="1"/>
+    <w:lsdException w:name="header" w:semiHidden="1" w:unhideWhenUsed="1"/>
+    <w:lsdException w:name="footer" w:semiHidden="1" w:unhideWhenUsed="1"/>
+    <w:lsdException w:name="index heading" w:semiHidden="1" w:unhideWhenUsed="1"/>
+    <w:lsdException w:name="caption" w:semiHidden="1" w:uiPriority="35" w:unhideWhenUsed="1" w:qFormat="1"/>
+    <w:lsdException w:name="table of figures" w:semiHidden="1" w:unhideWhenUsed="1"/>
+    <w:lsdException w:name="envelope address" w:semiHidden="1" w:unhideWhenUsed="1"/>
+    <w:lsdException w:name="envelope return" w:semiHidden="1" w:unhideWhenUsed="1"/>
+    <w:lsdException w:name="footnote reference" w:semiHidden="1" w:unhideWhenUsed="1"/>
+    <w:lsdException w:name="annotation reference" w:semiHidden="1" w:unhideWhenUsed="1"/>
+    <w:lsdException w:name="line number" w:semiHidden="1" w:unhideWhenUsed="1"/>
+    <w:lsdException w:name="page number" w:semiHidden="1" w:unhideWhenUsed="1"/>
+    <w:lsdException w:name="endnote reference" w:semiHidden="1" w:unhideWhenUsed="1"/>
+    <w:lsdException w:name="endnote text" w:semiHidden="1" w:unhideWhenUsed="1"/>
+    <w:lsdException w:name="table of authorities" w:semiHidden="1" w:unhideWhenUsed="1"/>
+    <w:lsdException w:name="macro" w:semiHidden="1" w:unhideWhenUsed="1"/>
+    <w:lsdException w:name="toa heading" w:semiHidden="1" w:unhideWhenUsed="1"/>
+    <w:lsdException w:name="List" w:semiHidden="1" w:unhideWhenUsed="1"/>
+    <w:lsdException w:name="List Bullet" w:semiHidden="1" w:unhideWhenUsed="1"/>
+    <w:lsdException w:name="List Number" w:semiHidden="1" w:unhideWhenUsed="1"/>
+    <w:lsdException w:name="List 2" w:semiHidden="1" w:unhideWhenUsed="1"/>
+    <w:lsdException w:name="List 3" w:semiHidden="1" w:unhideWhenUsed="1"/>
+    <w:lsdException w:name="List 4" w:semiHidden="1" w:unhideWhenUsed="1"/>
+    <w:lsdException w:name="List 5" w:semiHidden="1" w:unhideWhenUsed="1"/>
+    <w:lsdException w:name="List Bullet 2" w:semiHidden="1" w:unhideWhenUsed="1"/>
+    <w:lsdException w:name="List Bullet 3" w:semiHidden="1" w:unhideWhenUsed="1"/>
+    <w:lsdException w:name="List Bullet 4" w:semiHidden="1" w:unhideWhenUsed="1"/>
+    <w:lsdException w:name="List Bullet 5" w:semiHidden="1" w:unhideWhenUsed="1"/>
+    <w:lsdException w:name="List Number 2" w:semiHidden="1" w:unhideWhenUsed="1"/>
+    <w:lsdException w:name="List Number 3" w:semiHidden="1" w:unhideWhenUsed="1"/>
+    <w:lsdException w:name="List Number 4" w:semiHidden="1" w:unhideWhenUsed="1"/>
+    <w:lsdException w:name="List Number 5" w:semiHidden="1" w:unhideWhenUsed="1"/>
+    <w:lsdException w:name="Title" w:uiPriority="10" w:qFormat="1"/>
+    <w:lsdException w:name="Closing" w:semiHidden="1" w:unhideWhenUsed="1"/>
+    <w:lsdException w:name="Signature" w:semiHidden="1" w:unhideWhenUsed="1"/>
+    <w:lsdException w:name="Default Paragraph Font" w:semiHidden="1" w:uiPriority="1" w:unhideWhenUsed="1"/>
+    <w:lsdException w:name="Body Text" w:semiHidden="1" w:unhideWhenUsed="1"/>
+    <w:lsdException w:name="Body Text Indent" w:semiHidden="1" w:unhideWhenUsed="1"/>
+    <w:lsdException w:name="List Continue" w:semiHidden="1" w:unhideWhenUsed="1"/>
+    <w:lsdException w:name="List Continue 2" w:semiHidden="1" w:unhideWhenUsed="1"/>
+    <w:lsdException w:name="List Continue 3" w:semiHidden="1" w:unhideWhenUsed="1"/>
+    <w:lsdException w:name="List Continue 4" w:semiHidden="1" w:unhideWhenUsed="1"/>
+    <w:lsdException w:name="List Continue 5" w:semiHidden="1" w:unhideWhenUsed="1"/>
+    <w:lsdException w:name="Message Header" w:semiHidden="1" w:unhideWhenUsed="1"/>
+    <w:lsdException w:name="Subtitle" w:uiPriority="11" w:qFormat="1"/>
+    <w:lsdException w:name="Salutation" w:semiHidden="1" w:unhideWhenUsed="1"/>
+    <w:lsdException w:name="Date" w:semiHidden="1" w:unhideWhenUsed="1"/>
+    <w:lsdException w:name="Body Text First Indent" w:semiHidden="1" w:unhideWhenUsed="1"/>
+    <w:lsdException w:name="Body Text First Indent 2" w:semiHidden="1" w:unhideWhenUsed="1"/>
+    <w:lsdException w:name="Note Heading" w:semiHidden="1" w:unhideWhenUsed="1"/>
+    <w:lsdException w:name="Body Text 2" w:semiHidden="1" w:unhideWhenUsed="1"/>
+    <w:lsdException w:name="Body Text 3" w:semiHidden="1" w:unhideWhenUsed="1"/>
+    <w:lsdException w:name="Body Text Indent 2" w:semiHidden="1" w:unhideWhenUsed="1"/>
+    <w:lsdException w:name="Body Text Indent 3" w:semiHidden="1" w:unhideWhenUsed="1"/>
+    <w:lsdException w:name="Block Text" w:semiHidden="1" w:unhideWhenUsed="1"/>
+    <w:lsdException w:name="Hyperlink" w:semiHidden="1" w:unhideWhenUsed="1"/>
+    <w:lsdException w:name="FollowedHyperlink" w:semiHidden="1" w:unhideWhenUsed="1"/>
+    <w:lsdException w:name="Strong" w:uiPriority="22" w:qFormat="1"/>
+    <w:lsdException w:name="Emphasis" w:uiPriority="20" w:qFormat="1"/>
+    <w:lsdException w:name="Document Map" w:semiHidden="1" w:unhideWhenUsed="1"/>
+    <w:lsdException w:name="Plain Text" w:semiHidden="1" w:unhideWhenUsed="1"/>
+    <w:lsdException w:name="E-mail Signature" w:semiHidden="1" w:unhideWhenUsed="1"/>
+    <w:lsdException w:name="HTML Top of Form" w:semiHidden="1" w:unhideWhenUsed="1"/>
+    <w:lsdException w:name="HTML Bottom of Form" w:semiHidden="1" w:unhideWhenUsed="1"/>
+    <w:lsdException w:name="Normal (Web)" w:semiHidden="1" w:unhideWhenUsed="1"/>
+    <w:lsdException w:name="HTML Acronym" w:semiHidden="1" w:unhideWhenUsed="1"/>
+    <w:lsdException w:name="HTML Address" w:semiHidden="1" w:unhideWhenUsed="1"/>
+    <w:lsdException w:name="HTML Cite" w:semiHidden="1" w:unhideWhenUsed="1"/>
+    <w:lsdException w:name="HTML Code" w:semiHidden="1" w:unhideWhenUsed="1"/>
+    <w:lsdException w:name="HTML Definition" w:semiHidden="1" w:unhideWhenUsed="1"/>
+    <w:lsdException w:name="HTML Keyboard" w:semiHidden="1" w:unhideWhenUsed="1"/>
+    <w:lsdException w:name="HTML Preformatted" w:semiHidden="1" w:unhideWhenUsed="1"/>
+    <w:lsdException w:name="HTML Sample" w:semiHidden="1" w:unhideWhenUsed="1"/>
+    <w:lsdException w:name="HTML Typewriter" w:semiHidden="1" w:unhideWhenUsed="1"/>
+    <w:lsdException w:name="HTML Variable" w:semiHidden="1" w:unhideWhenUsed="1"/>
+    <w:lsdException w:name="Normal Table" w:semiHidden="1" w:unhideWhenUsed="1"/>
+    <w:lsdException w:name="annotation subject" w:semiHidden="1" w:unhideWhenUsed="1"/>
+    <w:lsdException w:name="No List" w:semiHidden="1" w:unhideWhenUsed="1"/>
+    <w:lsdException w:name="Outline List 1" w:semiHidden="1" w:unhideWhenUsed="1"/>
+    <w:lsdException w:name="Outline List 2" w:semiHidden="1" w:unhideWhenUsed="1"/>
+    <w:lsdException w:name="Outline List 3" w:semiHidden="1" w:unhideWhenUsed="1"/>
+    <w:lsdException w:name="Table Simple 1" w:semiHidden="1" w:unhideWhenUsed="1"/>
+    <w:lsdException w:name="Table Simple 2" w:semiHidden="1" w:unhideWhenUsed="1"/>
+    <w:lsdException w:name="Table Simple 3" w:semiHidden="1" w:unhideWhenUsed="1"/>
+    <w:lsdException w:name="Table Classic 1" w:semiHidden="1" w:unhideWhenUsed="1"/>
+    <w:lsdException w:name="Table Classic 2" w:semiHidden="1" w:unhideWhenUsed="1"/>
+    <w:lsdException w:name="Table Classic 3" w:semiHidden="1" w:unhideWhenUsed="1"/>
+    <w:lsdException w:name="Table Classic 4" w:semiHidden="1" w:unhideWhenUsed="1"/>
+    <w:lsdException w:name="Table Colorful 1" w:semiHidden="1" w:unhideWhenUsed="1"/>
+    <w:lsdException w:name="Table Colorful 2" w:semiHidden="1" w:unhideWhenUsed="1"/>
+    <w:lsdException w:name="Table Colorful 3" w:semiHidden="1" w:unhideWhenUsed="1"/>
+    <w:lsdException w:name="Table Columns 1" w:semiHidden="1" w:unhideWhenUsed="1"/>
+    <w:lsdException w:name="Table Columns 2" w:semiHidden="1" w:unhideWhenUsed="1"/>
+    <w:lsdException w:name="Table Columns 3" w:semiHidden="1" w:unhideWhenUsed="1"/>
+    <w:lsdException w:name="Table Columns 4" w:semiHidden="1" w:unhideWhenUsed="1"/>
+    <w:lsdException w:name="Table Columns 5" w:semiHidden="1" w:unhideWhenUsed="1"/>
+    <w:lsdException w:name="Table Grid 1" w:semiHidden="1" w:unhideWhenUsed="1"/>
+    <w:lsdException w:name="Table Grid 2" w:semiHidden="1" w:unhideWhenUsed="1"/>
+    <w:lsdException w:name="Table Grid 3" w:semiHidden="1" w:unhideWhenUsed="1"/>
+    <w:lsdException w:name="Table Grid 4" w:semiHidden="1" w:unhideWhenUsed="1"/>
+    <w:lsdException w:name="Table Grid 5" w:semiHidden="1" w:unhideWhenUsed="1"/>
+    <w:lsdException w:name="Table Grid 6" w:semiHidden="1" w:unhideWhenUsed="1"/>
+    <w:lsdException w:name="Table Grid 7" w:semiHidden="1" w:unhideWhenUsed="1"/>
+    <w:lsdException w:name="Table Grid 8" w:semiHidden="1" w:unhideWhenUsed="1"/>
+    <w:lsdException w:name="Table List 1" w:semiHidden="1" w:unhideWhenUsed="1"/>
+    <w:lsdException w:name="Table List 2" w:semiHidden="1" w:unhideWhenUsed="1"/>
+    <w:lsdException w:name="Table List 3" w:semiHidden="1" w:unhideWhenUsed="1"/>
+    <w:lsdException w:name="Table List 4" w:semiHidden="1" w:unhideWhenUsed="1"/>
+    <w:lsdException w:name="Table List 5" w:semiHidden="1" w:unhideWhenUsed="1"/>
+    <w:lsdException w:name="Table List 6" w:semiHidden="1" w:unhideWhenUsed="1"/>
+    <w:lsdException w:name="Table List 7" w:semiHidden="1" w:unhideWhenUsed="1"/>
+    <w:lsdException w:name="Table List 8" w:semiHidden="1" w:unhideWhenUsed="1"/>
+    <w:lsdException w:name="Table 3D effects 1" w:semiHidden="1" w:unhideWhenUsed="1"/>
+    <w:lsdException w:name="Table 3D effects 2" w:semiHidden="1" w:unhideWhenUsed="1"/>
+    <w:lsdException w:name="Table 3D effects 3" w:semiHidden="1" w:unhideWhenUsed="1"/>
+    <w:lsdException w:name="Table Contemporary" w:semiHidden="1" w:unhideWhenUsed="1"/>
+    <w:lsdException w:name="Table Elegant" w:semiHidden="1" w:unhideWhenUsed="1"/>
+    <w:lsdException w:name="Table Professional" w:semiHidden="1" w:unhideWhenUsed="1"/>
+    <w:lsdException w:name="Table Subtle 1" w:semiHidden="1" w:unhideWhenUsed="1"/>
+    <w:lsdException w:name="Table Subtle 2" w:semiHidden="1" w:unhideWhenUsed="1"/>
+    <w:lsdException w:name="Table Web 1" w:semiHidden="1" w:unhideWhenUsed="1"/>
+    <w:lsdException w:name="Table Web 2" w:semiHidden="1" w:unhideWhenUsed="1"/>
+    <w:lsdException w:name="Table Web 3" w:semiHidden="1" w:unhideWhenUsed="1"/>
+    <w:lsdException w:name="Balloon Text" w:semiHidden="1" w:unhideWhenUsed="1"/>
+    <w:lsdException w:name="Table Grid" w:uiPriority="39"/>
+    <w:lsdException w:name="Table Theme" w:semiHidden="1" w:unhideWhenUsed="1"/>
+    <w:lsdException w:name="Placeholder Text" w:semiHidden="1"/>
+    <w:lsdException w:name="No Spacing" w:uiPriority="1" w:qFormat="1"/>
+    <w:lsdException w:name="Light Shading" w:uiPriority="60"/>
+    <w:lsdException w:name="Light List" w:uiPriority="61"/>
+    <w:lsdException w:name="Light Grid" w:uiPriority="62"/>
+    <w:lsdException w:name="Medium Shading 1" w:uiPriority="63"/>
+    <w:lsdException w:name="Medium Shading 2" w:uiPriority="64"/>
+    <w:lsdException w:name="Medium List 1" w:uiPriority="65"/>
+    <w:lsdException w:name="Medium List 2" w:uiPriority="66"/>
+    <w:lsdException w:name="Medium Grid 1" w:uiPriority="67"/>
+    <w:lsdException w:name="Medium Grid 2" w:uiPriority="68"/>
+    <w:lsdException w:name="Medium Grid 3" w:uiPriority="69"/>
+    <w:lsdException w:name="Dark List" w:uiPriority="70"/>
+    <w:lsdException w:name="Colorful Shading" w:uiPriority="71"/>
+    <w:lsdException w:name="Colorful List" w:uiPriority="72"/>
+    <w:lsdException w:name="Colorful Grid" w:uiPriority="73"/>
+    <w:lsdException w:name="Light Shading Accent 1" w:uiPriority="60"/>
+    <w:lsdException w:name="Light List Accent 1" w:uiPriority="61"/>
+    <w:lsdException w:name="Light Grid Accent 1" w:uiPriority="62"/>
+    <w:lsdException w:name="Medium Shading 1 Accent 1" w:uiPriority="63"/>
+    <w:lsdException w:name="Medium Shading 2 Accent 1" w:uiPriority="64"/>
+    <w:lsdException w:name="Medium List 1 Accent 1" w:uiPriority="65"/>
+    <w:lsdException w:name="Revision" w:semiHidden="1"/>
+    <w:lsdException w:name="List Paragraph" w:uiPriority="34" w:qFormat="1"/>
+    <w:lsdException w:name="Quote" w:uiPriority="29" w:qFormat="1"/>
+    <w:lsdException w:name="Intense Quote" w:uiPriority="30" w:qFormat="1"/>
+    <w:lsdException w:name="Medium List 2 Accent 1" w:uiPriority="66"/>
+    <w:lsdException w:name="Medium Grid 1 Accent 1" w:uiPriority="67"/>
+    <w:lsdException w:name="Medium Grid 2 Accent 1" w:uiPriority="68"/>
+    <w:lsdException w:name="Medium Grid 3 Accent 1" w:uiPriority="69"/>
+    <w:lsdException w:name="Dark List Accent 1" w:uiPriority="70"/>
+    <w:lsdException w:name="Colorful Shading Accent 1" w:uiPriority="71"/>
+    <w:lsdException w:name="Colorful List Accent 1" w:uiPriority="72"/>
+    <w:lsdException w:name="Colorful Grid Accent 1" w:uiPriority="73"/>
+    <w:lsdException w:name="Light Shading Accent 2" w:uiPriority="60"/>
+    <w:lsdException w:name="Light List Accent 2" w:uiPriority="61"/>
+    <w:lsdException w:name="Light Grid Accent 2" w:uiPriority="62"/>
+    <w:lsdException w:name="Medium Shading 1 Accent 2" w:uiPriority="63"/>
+    <w:lsdException w:name="Medium Shading 2 Accent 2" w:uiPriority="64"/>
+    <w:lsdException w:name="Medium List 1 Accent 2" w:uiPriority="65"/>
+    <w:lsdException w:name="Medium List 2 Accent 2" w:uiPriority="66"/>
+    <w:lsdException w:name="Medium Grid 1 Accent 2" w:uiPriority="67"/>
+    <w:lsdException w:name="Medium Grid 2 Accent 2" w:uiPriority="68"/>
+    <w:lsdException w:name="Medium Grid 3 Accent 2" w:uiPriority="69"/>
+    <w:lsdException w:name="Dark List Accent 2" w:uiPriority="70"/>
+    <w:lsdException w:name="Colorful Shading Accent 2" w:uiPriority="71"/>
+    <w:lsdException w:name="Colorful List Accent 2" w:uiPriority="72"/>
+    <w:lsdException w:name="Colorful Grid Accent 2" w:uiPriority="73"/>
+    <w:lsdException w:name="Light Shading Accent 3" w:uiPriority="60"/>
+    <w:lsdException w:name="Light List Accent 3" w:uiPriority="61"/>
+    <w:lsdException w:name="Light Grid Accent 3" w:uiPriority="62"/>
+    <w:lsdException w:name="Medium Shading 1 Accent 3" w:uiPriority="63"/>
+    <w:lsdException w:name="Medium Shading 2 Accent 3" w:uiPriority="64"/>
+    <w:lsdException w:name="Medium List 1 Accent 3" w:uiPriority="65"/>
+    <w:lsdException w:name="Medium List 2 Accent 3" w:uiPriority="66"/>
+    <w:lsdException w:name="Medium Grid 1 Accent 3" w:uiPriority="67"/>
+    <w:lsdException w:name="Medium Grid 2 Accent 3" w:uiPriority="68"/>
+    <w:lsdException w:name="Medium Grid 3 Accent 3" w:uiPriority="69"/>
+    <w:lsdException w:name="Dark List Accent 3" w:uiPriority="70"/>
+    <w:lsdException w:name="Colorful Shading Accent 3" w:uiPriority="71"/>
+    <w:lsdException w:name="Colorful List Accent 3" w:uiPriority="72"/>
+    <w:lsdException w:name="Colorful Grid Accent 3" w:uiPriority="73"/>
+    <w:lsdException w:name="Light Shading Accent 4" w:uiPriority="60"/>
+    <w:lsdException w:name="Light List Accent 4" w:uiPriority="61"/>
+    <w:lsdException w:name="Light Grid Accent 4" w:uiPriority="62"/>
+    <w:lsdException w:name="Medium Shading 1 Accent 4" w:uiPriority="63"/>
+    <w:lsdException w:name="Medium Shading 2 Accent 4" w:uiPriority="64"/>
+    <w:lsdException w:name="Medium List 1 Accent 4" w:uiPriority="65"/>
+    <w:lsdException w:name="Medium List 2 Accent 4" w:uiPriority="66"/>
+    <w:lsdException w:name="Medium Grid 1 Accent 4" w:uiPriority="67"/>
+    <w:lsdException w:name="Medium Grid 2 Accent 4" w:uiPriority="68"/>
+    <w:lsdException w:name="Medium Grid 3 Accent 4" w:uiPriority="69"/>
+    <w:lsdException w:name="Dark List Accent 4" w:uiPriority="70"/>
+    <w:lsdException w:name="Colorful Shading Accent 4" w:uiPriority="71"/>
+    <w:lsdException w:name="Colorful List Accent 4" w:uiPriority="72"/>
+    <w:lsdException w:name="Colorful Grid Accent 4" w:uiPriority="73"/>
+    <w:lsdException w:name="Light Shading Accent 5" w:uiPriority="60"/>
+    <w:lsdException w:name="Light List Accent 5" w:uiPriority="61"/>
+    <w:lsdException w:name="Light Grid Accent 5" w:uiPriority="62"/>
+    <w:lsdException w:name="Medium Shading 1 Accent 5" w:uiPriority="63"/>
+    <w:lsdException w:name="Medium Shading 2 Accent 5" w:uiPriority="64"/>
+    <w:lsdException w:name="Medium List 1 Accent 5" w:uiPriority="65"/>
+    <w:lsdException w:name="Medium List 2 Accent 5" w:uiPriority="66"/>
+    <w:lsdException w:name="Medium Grid 1 Accent 5" w:uiPriority="67"/>
+    <w:lsdException w:name="Medium Grid 2 Accent 5" w:uiPriority="68"/>
+    <w:lsdException w:name="Medium Grid 3 Accent 5" w:uiPriority="69"/>
+    <w:lsdException w:name="Dark List Accent 5" w:uiPriority="70"/>
+    <w:lsdException w:name="Colorful Shading Accent 5" w:uiPriority="71"/>
+    <w:lsdException w:name="Colorful List Accent 5" w:uiPriority="72"/>
+    <w:lsdException w:name="Colorful Grid Accent 5" w:uiPriority="73"/>
+    <w:lsdException w:name="Light Shading Accent 6" w:uiPriority="60"/>
+    <w:lsdException w:name="Light List Accent 6" w:uiPriority="61"/>
+    <w:lsdException w:name="Light Grid Accent 6" w:uiPriority="62"/>
+    <w:lsdException w:name="Medium Shading 1 Accent 6" w:uiPriority="63"/>
+    <w:lsdException w:name="Medium Shading 2 Accent 6" w:uiPriority="64"/>
+    <w:lsdException w:name="Medium List 1 Accent 6" w:uiPriority="65"/>
+    <w:lsdException w:name="Medium List 2 Accent 6" w:uiPriority="66"/>
+    <w:lsdException w:name="Medium Grid 1 Accent 6" w:uiPriority="67"/>
+    <w:lsdException w:name="Medium Grid 2 Accent 6" w:uiPriority="68"/>
+    <w:lsdException w:name="Medium Grid 3 Accent 6" w:uiPriority="69"/>
+    <w:lsdException w:name="Dark List Accent 6" w:uiPriority="70"/>
+    <w:lsdException w:name="Colorful Shading Accent 6" w:uiPriority="71"/>
+    <w:lsdException w:name="Colorful List Accent 6" w:uiPriority="72"/>
+    <w:lsdException w:name="Colorful Grid Accent 6" w:uiPriority="73"/>
+    <w:lsdException w:name="Subtle Emphasis" w:uiPriority="19" w:qFormat="1"/>
+    <w:lsdException w:name="Intense Emphasis" w:uiPriority="21" w:qFormat="1"/>
+    <w:lsdException w:name="Subtle Reference" w:uiPriority="31" w:qFormat="1"/>
+    <w:lsdException w:name="Intense Reference" w:uiPriority="32" w:qFormat="1"/>
+    <w:lsdException w:name="Book Title" w:uiPriority="33" w:qFormat="1"/>
+    <w:lsdException w:name="Bibliography" w:semiHidden="1" w:uiPriority="37" w:unhideWhenUsed="1"/>
+    <w:lsdException w:name="TOC Heading" w:semiHidden="1" w:uiPriority="39" w:unhideWhenUsed="1" w:qFormat="1"/>
+    <w:lsdException w:name="Plain Table 1" w:uiPriority="41"/>
+    <w:lsdException w:name="Plain Table 2" w:uiPriority="42"/>
+    <w:lsdException w:name="Plain Table 3" w:uiPriority="43"/>
+    <w:lsdException w:name="Plain Table 4" w:uiPriority="44"/>
+    <w:lsdException w:name="Plain Table 5" w:uiPriority="45"/>
+    <w:lsdException w:name="Grid Table Light" w:uiPriority="40"/>
+    <w:lsdException w:name="Grid Table 1 Light" w:uiPriority="46"/>
+    <w:lsdException w:name="Grid Table 2" w:uiPriority="47"/>
+    <w:lsdException w:name="Grid Table 3" w:uiPriority="48"/>
+    <w:lsdException w:name="Grid Table 4" w:uiPriority="49"/>
+    <w:lsdException w:name="Grid Table 5 Dark" w:uiPriority="50"/>
+    <w:lsdException w:name="Grid Table 6 Colorful" w:uiPriority="51"/>
+    <w:lsdException w:name="Grid Table 7 Colorful" w:uiPriority="52"/>
+    <w:lsdException w:name="Grid Table 1 Light Accent 1" w:uiPriority="46"/>
+    <w:lsdException w:name="Grid Table 2 Accent 1" w:uiPriority="47"/>
+    <w:lsdException w:name="Grid Table 3 Accent 1" w:uiPriority="48"/>
+    <w:lsdException w:name="Grid Table 4 Accent 1" w:uiPriority="49"/>
+    <w:lsdException w:name="Grid Table 5 Dark Accent 1" w:uiPriority="50"/>
+    <w:lsdException w:name="Grid Table 6 Colorful Accent 1" w:uiPriority="51"/>
+    <w:lsdException w:name="Grid Table 7 Colorful Accent 1" w:uiPriority="52"/>
+    <w:lsdException w:name="Grid Table 1 Light Accent 2" w:uiPriority="46"/>
+    <w:lsdException w:name="Grid Table 2 Accent 2" w:uiPriority="47"/>
+    <w:lsdException w:name="Grid Table 3 Accent 2" w:uiPriority="48"/>
+    <w:lsdException w:name="Grid Table 4 Accent 2" w:uiPriority="49"/>
+    <w:lsdException w:name="Grid Table 5 Dark Accent 2" w:uiPriority="50"/>
+    <w:lsdException w:name="Grid Table 6 Colorful Accent 2" w:uiPriority="51"/>
+    <w:lsdException w:name="Grid Table 7 Colorful Accent 2" w:uiPriority="52"/>
+    <w:lsdException w:name="Grid Table 1 Light Accent 3" w:uiPriority="46"/>
+    <w:lsdException w:name="Grid Table 2 Accent 3" w:uiPriority="47"/>
+    <w:lsdException w:name="Grid Table 3 Accent 3" w:uiPriority="48"/>
+    <w:lsdException w:name="Grid Table 4 Accent 3" w:uiPriority="49"/>
+    <w:lsdException w:name="Grid Table 5 Dark Accent 3" w:uiPriority="50"/>
+    <w:lsdException w:name="Grid Table 6 Colorful Accent 3" w:uiPriority="51"/>
+    <w:lsdException w:name="Grid Table 7 Colorful Accent 3" w:uiPriority="52"/>
+    <w:lsdException w:name="Grid Table 1 Light Accent 4" w:uiPriority="46"/>
+    <w:lsdException w:name="Grid Table 2 Accent 4" w:uiPriority="47"/>
+    <w:lsdException w:name="Grid Table 3 Accent 4" w:uiPriority="48"/>
+    <w:lsdException w:name="Grid Table 4 Accent 4" w:uiPriority="49"/>
+    <w:lsdException w:name="Grid Table 5 Dark Accent 4" w:uiPriority="50"/>
+    <w:lsdException w:name="Grid Table 6 Colorful Accent 4" w:uiPriority="51"/>
+    <w:lsdException w:name="Grid Table 7 Colorful Accent 4" w:uiPriority="52"/>
+    <w:lsdException w:name="Grid Table 1 Light Accent 5" w:uiPriority="46"/>
+    <w:lsdException w:name="Grid Table 2 Accent 5" w:uiPriority="47"/>
+    <w:lsdException w:name="Grid Table 3 Accent 5" w:uiPriority="48"/>
+    <w:lsdException w:name="Grid Table 4 Accent 5" w:uiPriority="49"/>
+    <w:lsdException w:name="Grid Table 5 Dark Accent 5" w:uiPriority="50"/>
+    <w:lsdException w:name="Grid Table 6 Colorful Accent 5" w:uiPriority="51"/>
+    <w:lsdException w:name="Grid Table 7 Colorful Accent 5" w:uiPriority="52"/>
+    <w:lsdException w:name="Grid Table 1 Light Accent 6" w:uiPriority="46"/>
+    <w:lsdException w:name="Grid Table 2 Accent 6" w:uiPriority="47"/>
+    <w:lsdException w:name="Grid Table 3 Accent 6" w:uiPriority="48"/>
+    <w:lsdException w:name="Grid Table 4 Accent 6" w:uiPriority="49"/>
+    <w:lsdException w:name="Grid Table 5 Dark Accent 6" w:uiPriority="50"/>
+    <w:lsdException w:name="Grid Table 6 Colorful Accent 6" w:uiPriority="51"/>
+    <w:lsdException w:name="Grid Table 7 Colorful Accent 6" w:uiPriority="52"/>
+    <w:lsdException w:name="List Table 1 Light" w:uiPriority="46"/>
+    <w:lsdException w:name="List Table 2" w:uiPriority="47"/>
+    <w:lsdException w:name="List Table 3" w:uiPriority="48"/>
+    <w:lsdException w:name="List Table 4" w:uiPriority="49"/>
+    <w:lsdException w:name="List Table 5 Dark" w:uiPriority="50"/>
+    <w:lsdException w:name="List Table 6 Colorful" w:uiPriority="51"/>
+    <w:lsdException w:name="List Table 7 Colorful" w:uiPriority="52"/>
+    <w:lsdException w:name="List Table 1 Light Accent 1" w:uiPriority="46"/>
+    <w:lsdException w:name="List Table 2 Accent 1" w:uiPriority="47"/>
+    <w:lsdException w:name="List Table 3 Accent 1" w:uiPriority="48"/>
+    <w:lsdException w:name="List Table 4 Accent 1" w:uiPriority="49"/>
+    <w:lsdException w:name="List Table 5 Dark Accent 1" w:uiPriority="50"/>
+    <w:lsdException w:name="List Table 6 Colorful Accent 1" w:uiPriority="51"/>
+    <w:lsdException w:name="List Table 7 Colorful Accent 1" w:uiPriority="52"/>
+    <w:lsdException w:name="List Table 1 Light Accent 2" w:uiPriority="46"/>
+    <w:lsdException w:name="List Table 2 Accent 2" w:uiPriority="47"/>
+    <w:lsdException w:name="List Table 3 Accent 2" w:uiPriority="48"/>
+    <w:lsdException w:name="List Table 4 Accent 2" w:uiPriority="49"/>
+    <w:lsdException w:name="List Table 5 Dark Accent 2" w:uiPriority="50"/>
+    <w:lsdException w:name="List Table 6 Colorful Accent 2" w:uiPriority="51"/>
+    <w:lsdException w:name="List Table 7 Colorful Accent 2" w:uiPriority="52"/>
+    <w:lsdException w:name="List Table 1 Light Accent 3" w:uiPriority="46"/>
+    <w:lsdException w:name="List Table 2 Accent 3" w:uiPriority="47"/>
+    <w:lsdException w:name="List Table 3 Accent 3" w:uiPriority="48"/>
+    <w:lsdException w:name="List Table 4 Accent 3" w:uiPriority="49"/>
+    <w:lsdException w:name="List Table 5 Dark Accent 3" w:uiPriority="50"/>
+    <w:lsdException w:name="List Table 6 Colorful Accent 3" w:uiPriority="51"/>
+    <w:lsdException w:name="List Table 7 Colorful Accent 3" w:uiPriority="52"/>
+    <w:lsdException w:name="List Table 1 Light Accent 4" w:uiPriority="46"/>
+    <w:lsdException w:name="List Table 2 Accent 4" w:uiPriority="47"/>
+    <w:lsdException w:name="List Table 3 Accent 4" w:uiPriority="48"/>
+    <w:lsdException w:name="List Table 4 Accent 4" w:uiPriority="49"/>
+    <w:lsdException w:name="List Table 5 Dark Accent 4" w:uiPriority="50"/>
+    <w:lsdException w:name="List Table 6 Colorful Accent 4" w:uiPriority="51"/>
+    <w:lsdException w:name="List Table 7 Colorful Accent 4" w:uiPriority="52"/>
+    <w:lsdException w:name="List Table 1 Light Accent 5" w:uiPriority="46"/>
+    <w:lsdException w:name="List Table 2 Accent 5" w:uiPriority="47"/>
+    <w:lsdException w:name="List Table 3 Accent 5" w:uiPriority="48"/>
+    <w:lsdException w:name="List Table 4 Accent 5" w:uiPriority="49"/>
+    <w:lsdException w:name="List Table 5 Dark Accent 5" w:uiPriority="50"/>
+    <w:lsdException w:name="List Table 6 Colorful Accent 5" w:uiPriority="51"/>
+    <w:lsdException w:name="List Table 7 Colorful Accent 5" w:uiPriority="52"/>
+    <w:lsdException w:name="List Table 1 Light Accent 6" w:uiPriority="46"/>
+    <w:lsdException w:name="List Table 2 Accent 6" w:uiPriority="47"/>
+    <w:lsdException w:name="List Table 3 Accent 6" w:uiPriority="48"/>
+    <w:lsdException w:name="List Table 4 Accent 6" w:uiPriority="49"/>
+    <w:lsdException w:name="List Table 5 Dark Accent 6" w:uiPriority="50"/>
+    <w:lsdException w:name="List Table 6 Colorful Accent 6" w:uiPriority="51"/>
+    <w:lsdException w:name="List Table 7 Colorful Accent 6" w:uiPriority="52"/>
+    <w:lsdException w:name="Mention" w:semiHidden="1" w:unhideWhenUsed="1"/>
+    <w:lsdException w:name="Smart Hyperlink" w:semiHidden="1" w:unhideWhenUsed="1"/>
+    <w:lsdException w:name="Hashtag" w:semiHidden="1" w:unhideWhenUsed="1"/>
+    <w:lsdException w:name="Unresolved Mention" w:semiHidden="1" w:unhideWhenUsed="1"/>
+    <w:lsdException w:name="Smart Link" w:semiHidden="1" w:unhideWhenUsed="1"/>
+  </w:latentStyles>
+  <w:style w:type="paragraph" w:default="1" w:styleId="Normal">
+    <w:name w:val="Normal"/>
+    <w:qFormat/>
   </w:style>
-  <w:style w:type="paragraph" w:styleId="Normal" w:default="1">
-    <w:name w:val="normal"/>
-  </w:style>
-  <w:style w:type="paragraph" w:styleId="Heading1">
+  <w:style w:type="paragraph" w:styleId="Ttulo1">
     <w:name w:val="heading 1"/>
     <w:basedOn w:val="Normal"/>
     <w:next w:val="Normal"/>
+    <w:uiPriority w:val="9"/>
+    <w:qFormat/>
     <w:pPr>
-      <w:keepNext w:val="1"/>
-      <w:keepLines w:val="1"/>
-      <w:pageBreakBefore w:val="0"/>
-      <w:spacing w:after="120" w:before="400" w:lineRule="auto"/>
+      <w:keepNext/>
+      <w:keepLines/>
+      <w:spacing w:before="400" w:after="120"/>
+      <w:outlineLvl w:val="0"/>
     </w:pPr>
     <w:rPr>
       <w:sz w:val="40"/>
       <w:szCs w:val="40"/>
     </w:rPr>
   </w:style>
-  <w:style w:type="paragraph" w:styleId="Heading2">
+  <w:style w:type="paragraph" w:styleId="Ttulo2">
     <w:name w:val="heading 2"/>
     <w:basedOn w:val="Normal"/>
     <w:next w:val="Normal"/>
+    <w:uiPriority w:val="9"/>
+    <w:unhideWhenUsed/>
+    <w:qFormat/>
     <w:pPr>
-      <w:keepNext w:val="1"/>
-      <w:keepLines w:val="1"/>
-      <w:pageBreakBefore w:val="0"/>
-      <w:spacing w:after="120" w:before="360" w:lineRule="auto"/>
+      <w:keepNext/>
+      <w:keepLines/>
+      <w:spacing w:before="360" w:after="120"/>
+      <w:outlineLvl w:val="1"/>
     </w:pPr>
     <w:rPr>
-      <w:b w:val="0"/>
-      <w:bCs w:val="0"/>
       <w:sz w:val="32"/>
       <w:szCs w:val="32"/>
     </w:rPr>
   </w:style>
-  <w:style w:type="paragraph" w:styleId="Heading3">
+  <w:style w:type="paragraph" w:styleId="Ttulo3">
     <w:name w:val="heading 3"/>
     <w:basedOn w:val="Normal"/>
     <w:next w:val="Normal"/>
+    <w:uiPriority w:val="9"/>
+    <w:semiHidden/>
+    <w:unhideWhenUsed/>
+    <w:qFormat/>
     <w:pPr>
-      <w:keepNext w:val="1"/>
-      <w:keepLines w:val="1"/>
-      <w:pageBreakBefore w:val="0"/>
-      <w:spacing w:after="80" w:before="320" w:lineRule="auto"/>
+      <w:keepNext/>
+      <w:keepLines/>
+      <w:spacing w:before="320" w:after="80"/>
+      <w:outlineLvl w:val="2"/>
     </w:pPr>
     <w:rPr>
-      <w:b w:val="0"/>
-      <w:bCs w:val="0"/>
       <w:color w:val="434343"/>
       <w:sz w:val="28"/>
       <w:szCs w:val="28"/>
     </w:rPr>
   </w:style>
-  <w:style w:type="paragraph" w:styleId="Heading4">
+  <w:style w:type="paragraph" w:styleId="Ttulo4">
     <w:name w:val="heading 4"/>
     <w:basedOn w:val="Normal"/>
     <w:next w:val="Normal"/>
+    <w:uiPriority w:val="9"/>
+    <w:semiHidden/>
+    <w:unhideWhenUsed/>
+    <w:qFormat/>
     <w:pPr>
-      <w:keepNext w:val="1"/>
-      <w:keepLines w:val="1"/>
-      <w:pageBreakBefore w:val="0"/>
-      <w:spacing w:after="80" w:before="280" w:lineRule="auto"/>
+      <w:keepNext/>
+      <w:keepLines/>
+      <w:spacing w:before="280" w:after="80"/>
+      <w:outlineLvl w:val="3"/>
     </w:pPr>
     <w:rPr>
       <w:color w:val="666666"/>
@@ -889,73 +1365,125 @@
       <w:szCs w:val="24"/>
     </w:rPr>
   </w:style>
-  <w:style w:type="paragraph" w:styleId="Heading5">
+  <w:style w:type="paragraph" w:styleId="Ttulo5">
     <w:name w:val="heading 5"/>
     <w:basedOn w:val="Normal"/>
     <w:next w:val="Normal"/>
+    <w:uiPriority w:val="9"/>
+    <w:semiHidden/>
+    <w:unhideWhenUsed/>
+    <w:qFormat/>
     <w:pPr>
-      <w:keepNext w:val="1"/>
-      <w:keepLines w:val="1"/>
-      <w:pageBreakBefore w:val="0"/>
-      <w:spacing w:after="80" w:before="240" w:lineRule="auto"/>
+      <w:keepNext/>
+      <w:keepLines/>
+      <w:spacing w:before="240" w:after="80"/>
+      <w:outlineLvl w:val="4"/>
     </w:pPr>
     <w:rPr>
       <w:color w:val="666666"/>
-      <w:sz w:val="22"/>
-      <w:szCs w:val="22"/>
     </w:rPr>
   </w:style>
-  <w:style w:type="paragraph" w:styleId="Heading6">
+  <w:style w:type="paragraph" w:styleId="Ttulo6">
     <w:name w:val="heading 6"/>
     <w:basedOn w:val="Normal"/>
     <w:next w:val="Normal"/>
+    <w:uiPriority w:val="9"/>
+    <w:semiHidden/>
+    <w:unhideWhenUsed/>
+    <w:qFormat/>
     <w:pPr>
-      <w:keepNext w:val="1"/>
-      <w:keepLines w:val="1"/>
-      <w:pageBreakBefore w:val="0"/>
-      <w:spacing w:after="80" w:before="240" w:lineRule="auto"/>
+      <w:keepNext/>
+      <w:keepLines/>
+      <w:spacing w:before="240" w:after="80"/>
+      <w:outlineLvl w:val="5"/>
     </w:pPr>
     <w:rPr>
-      <w:i w:val="1"/>
-      <w:iCs w:val="1"/>
+      <w:i/>
+      <w:iCs/>
       <w:color w:val="666666"/>
-      <w:sz w:val="22"/>
-      <w:szCs w:val="22"/>
     </w:rPr>
   </w:style>
-  <w:style w:type="paragraph" w:styleId="Title">
+  <w:style w:type="character" w:default="1" w:styleId="Fuentedeprrafopredeter">
+    <w:name w:val="Default Paragraph Font"/>
+    <w:uiPriority w:val="1"/>
+    <w:semiHidden/>
+    <w:unhideWhenUsed/>
+  </w:style>
+  <w:style w:type="table" w:default="1" w:styleId="Tablanormal">
+    <w:name w:val="Normal Table"/>
+    <w:uiPriority w:val="99"/>
+    <w:semiHidden/>
+    <w:unhideWhenUsed/>
+    <w:tblPr>
+      <w:tblInd w:w="0" w:type="dxa"/>
+      <w:tblCellMar>
+        <w:top w:w="0" w:type="dxa"/>
+        <w:left w:w="108" w:type="dxa"/>
+        <w:bottom w:w="0" w:type="dxa"/>
+        <w:right w:w="108" w:type="dxa"/>
+      </w:tblCellMar>
+    </w:tblPr>
+  </w:style>
+  <w:style w:type="numbering" w:default="1" w:styleId="Sinlista">
+    <w:name w:val="No List"/>
+    <w:uiPriority w:val="99"/>
+    <w:semiHidden/>
+    <w:unhideWhenUsed/>
+  </w:style>
+  <w:style w:type="table" w:customStyle="1" w:styleId="TableNormal">
+    <w:name w:val="TableNormal"/>
+    <w:tblPr>
+      <w:tblCellMar>
+        <w:top w:w="100" w:type="dxa"/>
+        <w:left w:w="100" w:type="dxa"/>
+        <w:bottom w:w="100" w:type="dxa"/>
+        <w:right w:w="100" w:type="dxa"/>
+      </w:tblCellMar>
+    </w:tblPr>
+  </w:style>
+  <w:style w:type="paragraph" w:styleId="Ttulo">
     <w:name w:val="Title"/>
     <w:basedOn w:val="Normal"/>
     <w:next w:val="Normal"/>
+    <w:uiPriority w:val="10"/>
+    <w:qFormat/>
     <w:pPr>
-      <w:keepNext w:val="1"/>
-      <w:keepLines w:val="1"/>
-      <w:pageBreakBefore w:val="0"/>
-      <w:spacing w:after="60" w:before="0" w:lineRule="auto"/>
+      <w:keepNext/>
+      <w:keepLines/>
+      <w:spacing w:after="60"/>
     </w:pPr>
     <w:rPr>
       <w:sz w:val="52"/>
       <w:szCs w:val="52"/>
     </w:rPr>
   </w:style>
-  <w:style w:type="paragraph" w:styleId="Subtitle">
+  <w:style w:type="paragraph" w:styleId="Subttulo">
     <w:name w:val="Subtitle"/>
     <w:basedOn w:val="Normal"/>
     <w:next w:val="Normal"/>
+    <w:uiPriority w:val="11"/>
+    <w:qFormat/>
     <w:pPr>
-      <w:keepNext w:val="1"/>
-      <w:keepLines w:val="1"/>
-      <w:pageBreakBefore w:val="0"/>
-      <w:spacing w:after="320" w:before="0" w:lineRule="auto"/>
+      <w:keepNext/>
+      <w:keepLines/>
+      <w:spacing w:after="320"/>
     </w:pPr>
     <w:rPr>
-      <w:rFonts w:ascii="Arial" w:cs="Arial" w:eastAsia="Arial" w:hAnsi="Arial"/>
-      <w:i w:val="0"/>
-      <w:iCs w:val="0"/>
       <w:color w:val="666666"/>
       <w:sz w:val="30"/>
       <w:szCs w:val="30"/>
     </w:rPr>
+  </w:style>
+  <w:style w:type="paragraph" w:styleId="Prrafodelista">
+    <w:name w:val="List Paragraph"/>
+    <w:basedOn w:val="Normal"/>
+    <w:uiPriority w:val="34"/>
+    <w:qFormat/>
+    <w:rsid w:val="005667F4"/>
+    <w:pPr>
+      <w:ind w:left="720"/>
+      <w:contextualSpacing/>
+    </w:pPr>
   </w:style>
 </w:styles>
 </file>

</xml_diff>

<commit_message>
Avanzando en el documento de control de git
</commit_message>
<xml_diff>
--- a/Control_git_miimperio.docx
+++ b/Control_git_miimperio.docx
@@ -667,6 +667,9 @@
     </w:p>
     <w:p>
       <w:r>
+        <w:rPr>
+          <w:noProof/>
+        </w:rPr>
         <w:drawing>
           <wp:inline distT="0" distB="0" distL="0" distR="0" wp14:anchorId="67FDAECC" wp14:editId="1F957533">
             <wp:extent cx="5733415" cy="1842135"/>
@@ -712,6 +715,9 @@
     </w:p>
     <w:p>
       <w:r>
+        <w:rPr>
+          <w:noProof/>
+        </w:rPr>
         <w:drawing>
           <wp:inline distT="0" distB="0" distL="0" distR="0" wp14:anchorId="37B85FE8" wp14:editId="49661292">
             <wp:extent cx="5733415" cy="1434465"/>
@@ -749,6 +755,220 @@
         </w:drawing>
       </w:r>
     </w:p>
+    <w:p/>
+    <w:p>
+      <w:pPr>
+        <w:pStyle w:val="Ttulo2"/>
+        <w:numPr>
+          <w:ilvl w:val="0"/>
+          <w:numId w:val="1"/>
+        </w:numPr>
+      </w:pPr>
+      <w:r>
+        <w:t xml:space="preserve">Pruebas con </w:t>
+      </w:r>
+      <w:proofErr w:type="spellStart"/>
+      <w:r>
+        <w:t>Pytest</w:t>
+      </w:r>
+      <w:proofErr w:type="spellEnd"/>
+    </w:p>
+    <w:p>
+      <w:r>
+        <w:t xml:space="preserve">Tras hacer el primer borrador del código, lo probamos con </w:t>
+      </w:r>
+      <w:proofErr w:type="spellStart"/>
+      <w:r>
+        <w:t>pytest</w:t>
+      </w:r>
+      <w:proofErr w:type="spellEnd"/>
+      <w:r>
+        <w:t xml:space="preserve"> para ver si da error y arreglar las </w:t>
+      </w:r>
+      <w:proofErr w:type="spellStart"/>
+      <w:r>
+        <w:t>inconcluencias</w:t>
+      </w:r>
+      <w:proofErr w:type="spellEnd"/>
+      <w:r>
+        <w:t>:</w:t>
+      </w:r>
+    </w:p>
+    <w:p>
+      <w:r>
+        <w:drawing>
+          <wp:inline distT="0" distB="0" distL="0" distR="0" wp14:anchorId="7ED47555" wp14:editId="1E32F5B5">
+            <wp:extent cx="5733415" cy="882015"/>
+            <wp:effectExtent l="0" t="0" r="635" b="0"/>
+            <wp:docPr id="1841353903" name="Imagen 1"/>
+            <wp:cNvGraphicFramePr>
+              <a:graphicFrameLocks xmlns:a="http://schemas.openxmlformats.org/drawingml/2006/main" noChangeAspect="1"/>
+            </wp:cNvGraphicFramePr>
+            <a:graphic xmlns:a="http://schemas.openxmlformats.org/drawingml/2006/main">
+              <a:graphicData uri="http://schemas.openxmlformats.org/drawingml/2006/picture">
+                <pic:pic xmlns:pic="http://schemas.openxmlformats.org/drawingml/2006/picture">
+                  <pic:nvPicPr>
+                    <pic:cNvPr id="1841353903" name=""/>
+                    <pic:cNvPicPr/>
+                  </pic:nvPicPr>
+                  <pic:blipFill>
+                    <a:blip r:embed="rId16"/>
+                    <a:stretch>
+                      <a:fillRect/>
+                    </a:stretch>
+                  </pic:blipFill>
+                  <pic:spPr>
+                    <a:xfrm>
+                      <a:off x="0" y="0"/>
+                      <a:ext cx="5733415" cy="882015"/>
+                    </a:xfrm>
+                    <a:prstGeom prst="rect">
+                      <a:avLst/>
+                    </a:prstGeom>
+                  </pic:spPr>
+                </pic:pic>
+              </a:graphicData>
+            </a:graphic>
+          </wp:inline>
+        </w:drawing>
+      </w:r>
+    </w:p>
+    <w:p>
+      <w:r>
+        <w:t xml:space="preserve">La primera prueba ha pasado los </w:t>
+      </w:r>
+      <w:proofErr w:type="spellStart"/>
+      <w:r>
+        <w:t>tests</w:t>
+      </w:r>
+      <w:proofErr w:type="spellEnd"/>
+      <w:r>
+        <w:t>, lo añadimos al repositorio:</w:t>
+      </w:r>
+    </w:p>
+    <w:p>
+      <w:r>
+        <w:lastRenderedPageBreak/>
+        <w:drawing>
+          <wp:inline distT="0" distB="0" distL="0" distR="0" wp14:anchorId="553FAD69" wp14:editId="7964D489">
+            <wp:extent cx="5733415" cy="5328285"/>
+            <wp:effectExtent l="0" t="0" r="635" b="5715"/>
+            <wp:docPr id="106070809" name="Imagen 1"/>
+            <wp:cNvGraphicFramePr>
+              <a:graphicFrameLocks xmlns:a="http://schemas.openxmlformats.org/drawingml/2006/main" noChangeAspect="1"/>
+            </wp:cNvGraphicFramePr>
+            <a:graphic xmlns:a="http://schemas.openxmlformats.org/drawingml/2006/main">
+              <a:graphicData uri="http://schemas.openxmlformats.org/drawingml/2006/picture">
+                <pic:pic xmlns:pic="http://schemas.openxmlformats.org/drawingml/2006/picture">
+                  <pic:nvPicPr>
+                    <pic:cNvPr id="106070809" name=""/>
+                    <pic:cNvPicPr/>
+                  </pic:nvPicPr>
+                  <pic:blipFill>
+                    <a:blip r:embed="rId17"/>
+                    <a:stretch>
+                      <a:fillRect/>
+                    </a:stretch>
+                  </pic:blipFill>
+                  <pic:spPr>
+                    <a:xfrm>
+                      <a:off x="0" y="0"/>
+                      <a:ext cx="5733415" cy="5328285"/>
+                    </a:xfrm>
+                    <a:prstGeom prst="rect">
+                      <a:avLst/>
+                    </a:prstGeom>
+                  </pic:spPr>
+                </pic:pic>
+              </a:graphicData>
+            </a:graphic>
+          </wp:inline>
+        </w:drawing>
+      </w:r>
+    </w:p>
+    <w:p/>
+    <w:p>
+      <w:pPr>
+        <w:pStyle w:val="Ttulo2"/>
+        <w:numPr>
+          <w:ilvl w:val="0"/>
+          <w:numId w:val="1"/>
+        </w:numPr>
+      </w:pPr>
+      <w:r>
+        <w:t>Añadimos un Tag</w:t>
+      </w:r>
+    </w:p>
+    <w:p>
+      <w:r>
+        <w:t xml:space="preserve">Hemos añadido </w:t>
+      </w:r>
+      <w:proofErr w:type="gramStart"/>
+      <w:r>
+        <w:t>un test</w:t>
+      </w:r>
+      <w:proofErr w:type="gramEnd"/>
+      <w:r>
+        <w:t xml:space="preserve"> al </w:t>
+      </w:r>
+      <w:proofErr w:type="spellStart"/>
+      <w:r>
+        <w:t>pytest</w:t>
+      </w:r>
+      <w:proofErr w:type="spellEnd"/>
+      <w:r>
+        <w:t xml:space="preserve"> y modificado una parte, lo probamos con </w:t>
+      </w:r>
+      <w:proofErr w:type="spellStart"/>
+      <w:r>
+        <w:t>pytest</w:t>
+      </w:r>
+      <w:proofErr w:type="spellEnd"/>
+      <w:r>
+        <w:t xml:space="preserve"> y si no da error lo guardamos en un tag y lo subimos:</w:t>
+      </w:r>
+    </w:p>
+    <w:p>
+      <w:r>
+        <w:lastRenderedPageBreak/>
+        <w:drawing>
+          <wp:inline distT="0" distB="0" distL="0" distR="0" wp14:anchorId="5A8D119D" wp14:editId="3D9EBC38">
+            <wp:extent cx="5733415" cy="2875915"/>
+            <wp:effectExtent l="0" t="0" r="635" b="635"/>
+            <wp:docPr id="463827339" name="Imagen 1"/>
+            <wp:cNvGraphicFramePr>
+              <a:graphicFrameLocks xmlns:a="http://schemas.openxmlformats.org/drawingml/2006/main" noChangeAspect="1"/>
+            </wp:cNvGraphicFramePr>
+            <a:graphic xmlns:a="http://schemas.openxmlformats.org/drawingml/2006/main">
+              <a:graphicData uri="http://schemas.openxmlformats.org/drawingml/2006/picture">
+                <pic:pic xmlns:pic="http://schemas.openxmlformats.org/drawingml/2006/picture">
+                  <pic:nvPicPr>
+                    <pic:cNvPr id="463827339" name=""/>
+                    <pic:cNvPicPr/>
+                  </pic:nvPicPr>
+                  <pic:blipFill>
+                    <a:blip r:embed="rId18"/>
+                    <a:stretch>
+                      <a:fillRect/>
+                    </a:stretch>
+                  </pic:blipFill>
+                  <pic:spPr>
+                    <a:xfrm>
+                      <a:off x="0" y="0"/>
+                      <a:ext cx="5733415" cy="2875915"/>
+                    </a:xfrm>
+                    <a:prstGeom prst="rect">
+                      <a:avLst/>
+                    </a:prstGeom>
+                  </pic:spPr>
+                </pic:pic>
+              </a:graphicData>
+            </a:graphic>
+          </wp:inline>
+        </w:drawing>
+      </w:r>
+    </w:p>
+    <w:p/>
     <w:p/>
     <w:p>
       <w:pPr>

</xml_diff>